<commit_message>
Exit ticket de la Sesión 1 con 5 desafíos básicos tipo Bebras; guías más cortas (sin datos, citas aparte, palabras clave ni revisión: van en la página; las citas van dentro del trabajo); Investigación sin «Lo que ya sabía»; Diseño con «¿Qué dice la ciencia?»
Co-Authored-By: Claude Opus 5.5 <noreply@anthropic.com>
Claude-Session: https://claude.ai/code/session_01GLj1XaXL3zPjkcPgbeyeYx
</commit_message>
<xml_diff>
--- a/docs/guias/dis.docx
+++ b/docs/guias/dis.docx
@@ -69,7 +69,7 @@
           </w:p>
           <w:p>
             <w:pPr>
-              <w:spacing w:after="0" w:before="0" w:line="276"/>
+              <w:spacing w:after="40" w:before="0" w:line="276"/>
             </w:pPr>
             <w:r>
               <w:rPr>
@@ -79,6 +79,22 @@
                 <w:szCs w:val="19"/>
               </w:rPr>
               <w:t xml:space="preserve">Planificas un experimento para comprobar una hipótesis.</w:t>
+            </w:r>
+          </w:p>
+          <w:p>
+            <w:pPr>
+              <w:spacing w:after="0" w:before="0" w:line="276"/>
+            </w:pPr>
+            <w:r>
+              <w:rPr>
+                <w:rFonts w:ascii="Arial" w:cs="Arial" w:eastAsia="Arial" w:hAnsi="Arial"/>
+                <w:b/>
+                <w:bCs/>
+                <w:color w:val="FDE68A"/>
+                <w:sz w:val="18"/>
+                <w:szCs w:val="18"/>
+              </w:rPr>
+              <w:t xml:space="preserve">✍️ Usa mínimo 3 citas parafraseadas dentro de tu trabajo y escribe sus fuentes al final.</w:t>
             </w:r>
           </w:p>
         </w:tc>
@@ -158,7 +174,7 @@
                 <w:sz w:val="26"/>
                 <w:szCs w:val="26"/>
               </w:rPr>
-              <w:t xml:space="preserve">🏷️ Datos de tu trabajo</w:t>
+              <w:t xml:space="preserve">❓ Pregunta de indagación</w:t>
             </w:r>
           </w:p>
           <w:p>
@@ -172,7 +188,7 @@
                 <w:sz w:val="18"/>
                 <w:szCs w:val="18"/>
               </w:rPr>
-              <w:t xml:space="preserve">Completa todo: así sabremos quién lo hizo.</w:t>
+              <w:t xml:space="preserve">Debe relacionar una causa con un efecto.</w:t>
             </w:r>
           </w:p>
         </w:tc>
@@ -196,18 +212,19 @@
           </w:tcPr>
           <w:p>
             <w:pPr>
-              <w:spacing w:after="0" w:before="60" w:line="276"/>
-            </w:pPr>
-            <w:r>
-              <w:rPr>
-                <w:rFonts w:ascii="Arial" w:cs="Arial" w:eastAsia="Arial" w:hAnsi="Arial"/>
-                <w:b/>
-                <w:bCs/>
-                <w:color w:val="0B2E4F"/>
-                <w:sz w:val="18"/>
-                <w:szCs w:val="18"/>
-              </w:rPr>
-              <w:t xml:space="preserve">Título</w:t>
+              <w:pBdr>
+                <w:bottom w:val="dashed" w:color="9FB3C8" w:sz="6" w:space="1"/>
+              </w:pBdr>
+              <w:spacing w:after="0" w:before="0" w:line="420"/>
+            </w:pPr>
+            <w:r>
+              <w:rPr>
+                <w:rFonts w:ascii="Arial" w:cs="Arial" w:eastAsia="Arial" w:hAnsi="Arial"/>
+                <w:color w:val="1E293B"/>
+                <w:sz w:val="21"/>
+                <w:szCs w:val="21"/>
+              </w:rPr>
+              <w:t xml:space="preserve"> </w:t>
             </w:r>
           </w:p>
           <w:p>
@@ -240,73 +257,7 @@
                 <w:sz w:val="17"/>
                 <w:szCs w:val="17"/>
               </w:rPr>
-              <w:t xml:space="preserve">Ejemplo: ¿Cómo influye la temperatura en la levadura?</w:t>
-            </w:r>
-          </w:p>
-          <w:p>
-            <w:pPr>
-              <w:spacing w:after="0" w:before="60" w:line="276"/>
-            </w:pPr>
-            <w:r>
-              <w:rPr>
-                <w:rFonts w:ascii="Arial" w:cs="Arial" w:eastAsia="Arial" w:hAnsi="Arial"/>
-                <w:b/>
-                <w:bCs/>
-                <w:color w:val="0B2E4F"/>
-                <w:sz w:val="18"/>
-                <w:szCs w:val="18"/>
-              </w:rPr>
-              <w:t xml:space="preserve">Autor(es)</w:t>
-            </w:r>
-          </w:p>
-          <w:p>
-            <w:pPr>
-              <w:pBdr>
-                <w:bottom w:val="dashed" w:color="9FB3C8" w:sz="6" w:space="1"/>
-              </w:pBdr>
-              <w:spacing w:after="0" w:before="0" w:line="420"/>
-            </w:pPr>
-            <w:r>
-              <w:rPr>
-                <w:rFonts w:ascii="Arial" w:cs="Arial" w:eastAsia="Arial" w:hAnsi="Arial"/>
-                <w:color w:val="1E293B"/>
-                <w:sz w:val="21"/>
-                <w:szCs w:val="21"/>
-              </w:rPr>
-              <w:t xml:space="preserve"> </w:t>
-            </w:r>
-          </w:p>
-          <w:p>
-            <w:pPr>
-              <w:spacing w:after="0" w:before="60" w:line="276"/>
-            </w:pPr>
-            <w:r>
-              <w:rPr>
-                <w:rFonts w:ascii="Arial" w:cs="Arial" w:eastAsia="Arial" w:hAnsi="Arial"/>
-                <w:b/>
-                <w:bCs/>
-                <w:color w:val="0B2E4F"/>
-                <w:sz w:val="18"/>
-                <w:szCs w:val="18"/>
-              </w:rPr>
-              <w:t xml:space="preserve">Grado y sección · Año</w:t>
-            </w:r>
-          </w:p>
-          <w:p>
-            <w:pPr>
-              <w:pBdr>
-                <w:bottom w:val="dashed" w:color="9FB3C8" w:sz="6" w:space="1"/>
-              </w:pBdr>
-              <w:spacing w:after="0" w:before="0" w:line="420"/>
-            </w:pPr>
-            <w:r>
-              <w:rPr>
-                <w:rFonts w:ascii="Arial" w:cs="Arial" w:eastAsia="Arial" w:hAnsi="Arial"/>
-                <w:color w:val="1E293B"/>
-                <w:sz w:val="21"/>
-                <w:szCs w:val="21"/>
-              </w:rPr>
-              <w:t xml:space="preserve"> </w:t>
+              <w:t xml:space="preserve">Ejemplo: ¿Cómo influye la temperatura del agua en la actividad de la levadura?</w:t>
             </w:r>
           </w:p>
         </w:tc>
@@ -386,7 +337,7 @@
                 <w:sz w:val="26"/>
                 <w:szCs w:val="26"/>
               </w:rPr>
-              <w:t xml:space="preserve">❓ Pregunta de indagación</w:t>
+              <w:t xml:space="preserve">📖 ¿Qué dice la ciencia?</w:t>
             </w:r>
           </w:p>
           <w:p>
@@ -400,7 +351,7 @@
                 <w:sz w:val="18"/>
                 <w:szCs w:val="18"/>
               </w:rPr>
-              <w:t xml:space="preserve">Debe relacionar una causa con un efecto.</w:t>
+              <w:t xml:space="preserve">Lo que encontraste en fuentes confiables sobre tu tema. ✍️ Aquí van tus 3 citas: «Según López (2020), …» o «… (Soto, 2019)».</w:t>
             </w:r>
           </w:p>
         </w:tc>
@@ -458,18 +409,53 @@
           </w:p>
           <w:p>
             <w:pPr>
-              <w:spacing w:after="80" w:before="40" w:line="276"/>
-            </w:pPr>
-            <w:r>
-              <w:rPr>
-                <w:rFonts w:ascii="Arial" w:cs="Arial" w:eastAsia="Arial" w:hAnsi="Arial"/>
-                <w:i/>
-                <w:iCs/>
-                <w:color w:val="64748B"/>
-                <w:sz w:val="17"/>
-                <w:szCs w:val="17"/>
-              </w:rPr>
-              <w:t xml:space="preserve">Ejemplo: ¿Cómo influye la temperatura del agua en la actividad de la levadura?</w:t>
+              <w:pBdr>
+                <w:bottom w:val="dashed" w:color="9FB3C8" w:sz="6" w:space="1"/>
+              </w:pBdr>
+              <w:spacing w:after="0" w:before="0" w:line="420"/>
+            </w:pPr>
+            <w:r>
+              <w:rPr>
+                <w:rFonts w:ascii="Arial" w:cs="Arial" w:eastAsia="Arial" w:hAnsi="Arial"/>
+                <w:color w:val="1E293B"/>
+                <w:sz w:val="21"/>
+                <w:szCs w:val="21"/>
+              </w:rPr>
+              <w:t xml:space="preserve"> </w:t>
+            </w:r>
+          </w:p>
+          <w:p>
+            <w:pPr>
+              <w:pBdr>
+                <w:bottom w:val="dashed" w:color="9FB3C8" w:sz="6" w:space="1"/>
+              </w:pBdr>
+              <w:spacing w:after="0" w:before="0" w:line="420"/>
+            </w:pPr>
+            <w:r>
+              <w:rPr>
+                <w:rFonts w:ascii="Arial" w:cs="Arial" w:eastAsia="Arial" w:hAnsi="Arial"/>
+                <w:color w:val="1E293B"/>
+                <w:sz w:val="21"/>
+                <w:szCs w:val="21"/>
+              </w:rPr>
+              <w:t xml:space="preserve"> </w:t>
+            </w:r>
+          </w:p>
+          <w:p>
+            <w:pPr>
+              <w:pBdr>
+                <w:bottom w:val="dashed" w:color="9FB3C8" w:sz="6" w:space="1"/>
+              </w:pBdr>
+              <w:spacing w:after="0" w:before="0" w:line="420"/>
+            </w:pPr>
+            <w:r>
+              <w:rPr>
+                <w:rFonts w:ascii="Arial" w:cs="Arial" w:eastAsia="Arial" w:hAnsi="Arial"/>
+                <w:color w:val="1E293B"/>
+                <w:sz w:val="21"/>
+                <w:szCs w:val="21"/>
+              </w:rPr>
+              <w:t xml:space="preserve"> </w:t>
             </w:r>
           </w:p>
         </w:tc>
@@ -2442,7 +2428,7 @@
                 <w:sz w:val="26"/>
                 <w:szCs w:val="26"/>
               </w:rPr>
-              <w:t xml:space="preserve">💬 Mis 3 citas parafraseadas (Normas APA)</w:t>
+              <w:t xml:space="preserve">📚 Mis fuentes (Referencias APA)</w:t>
             </w:r>
           </w:p>
           <w:p>
@@ -2456,7 +2442,7 @@
                 <w:sz w:val="18"/>
                 <w:szCs w:val="18"/>
               </w:rPr>
-              <w:t xml:space="preserve">Cuenta lo que dijo un experto con TUS palabras (sin copiar). Úsalas dentro de tu trabajo.</w:t>
+              <w:t xml:space="preserve">Escribe de dónde sacaste cada cita.</w:t>
             </w:r>
           </w:p>
         </w:tc>
@@ -2480,56 +2466,34 @@
           </w:tcPr>
           <w:p>
             <w:pPr>
-              <w:spacing w:after="20" w:before="0" w:line="276"/>
-            </w:pPr>
-            <w:r>
-              <w:rPr>
-                <w:rFonts w:ascii="Arial" w:cs="Arial" w:eastAsia="Arial" w:hAnsi="Arial"/>
-                <w:b/>
-                <w:bCs/>
-                <w:color w:val="5B21B6"/>
-                <w:sz w:val="21"/>
-                <w:szCs w:val="21"/>
-              </w:rPr>
-              <w:t xml:space="preserve">A. Cita narrativa: </w:t>
-            </w:r>
+              <w:spacing w:after="80" w:before="40" w:line="276"/>
+            </w:pPr>
             <w:r>
               <w:rPr>
                 <w:rFonts w:ascii="Arial" w:cs="Arial" w:eastAsia="Arial" w:hAnsi="Arial"/>
                 <w:i/>
                 <w:iCs/>
-                <w:color w:val="1E293B"/>
-                <w:sz w:val="21"/>
-                <w:szCs w:val="21"/>
-              </w:rPr>
-              <w:t xml:space="preserve">Según López (2020), la tecnología cambió cómo aprendemos.</w:t>
-            </w:r>
-          </w:p>
-          <w:p>
-            <w:pPr>
-              <w:spacing w:after="60" w:before="0" w:line="276"/>
-            </w:pPr>
-            <w:r>
-              <w:rPr>
-                <w:rFonts w:ascii="Arial" w:cs="Arial" w:eastAsia="Arial" w:hAnsi="Arial"/>
-                <w:b/>
-                <w:bCs/>
-                <w:color w:val="5B21B6"/>
-                <w:sz w:val="21"/>
-                <w:szCs w:val="21"/>
-              </w:rPr>
-              <w:t xml:space="preserve">B. Cita parentética: </w:t>
-            </w:r>
+                <w:color w:val="64748B"/>
+                <w:sz w:val="17"/>
+                <w:szCs w:val="17"/>
+              </w:rPr>
+              <w:t xml:space="preserve">Orden: Autor o institución. (Año). Título. Página web o libro.</w:t>
+            </w:r>
+          </w:p>
+          <w:p>
+            <w:pPr>
+              <w:spacing w:after="80" w:before="40" w:line="276"/>
+            </w:pPr>
             <w:r>
               <w:rPr>
                 <w:rFonts w:ascii="Arial" w:cs="Arial" w:eastAsia="Arial" w:hAnsi="Arial"/>
                 <w:i/>
                 <w:iCs/>
-                <w:color w:val="1E293B"/>
-                <w:sz w:val="21"/>
-                <w:szCs w:val="21"/>
-              </w:rPr>
-              <w:t xml:space="preserve">La tecnología transformó la educación (Soto, 2019).</w:t>
+                <w:color w:val="64748B"/>
+                <w:sz w:val="17"/>
+                <w:szCs w:val="17"/>
+              </w:rPr>
+              <w:t xml:space="preserve">Ejemplo: Ministerio de Salud. (2025). Dengue: síntomas y prevención. gob.pe</w:t>
             </w:r>
           </w:p>
           <w:p>
@@ -2545,24 +2509,7 @@
                 <w:sz w:val="18"/>
                 <w:szCs w:val="18"/>
               </w:rPr>
-              <w:t xml:space="preserve">Cita 1   (Molde A: Según ______ (año), …   ·   Molde B: … (Apellido, año).)</w:t>
-            </w:r>
-          </w:p>
-          <w:p>
-            <w:pPr>
-              <w:pBdr>
-                <w:bottom w:val="dashed" w:color="9FB3C8" w:sz="6" w:space="1"/>
-              </w:pBdr>
-              <w:spacing w:after="0" w:before="0" w:line="420"/>
-            </w:pPr>
-            <w:r>
-              <w:rPr>
-                <w:rFonts w:ascii="Arial" w:cs="Arial" w:eastAsia="Arial" w:hAnsi="Arial"/>
-                <w:color w:val="1E293B"/>
-                <w:sz w:val="21"/>
-                <w:szCs w:val="21"/>
-              </w:rPr>
-              <w:t xml:space="preserve"> </w:t>
+              <w:t xml:space="preserve">Fuente 1</w:t>
             </w:r>
           </w:p>
           <w:p>
@@ -2595,24 +2542,7 @@
                 <w:sz w:val="18"/>
                 <w:szCs w:val="18"/>
               </w:rPr>
-              <w:t xml:space="preserve">Cita 2   (Molde A: Según ______ (año), …   ·   Molde B: … (Apellido, año).)</w:t>
-            </w:r>
-          </w:p>
-          <w:p>
-            <w:pPr>
-              <w:pBdr>
-                <w:bottom w:val="dashed" w:color="9FB3C8" w:sz="6" w:space="1"/>
-              </w:pBdr>
-              <w:spacing w:after="0" w:before="0" w:line="420"/>
-            </w:pPr>
-            <w:r>
-              <w:rPr>
-                <w:rFonts w:ascii="Arial" w:cs="Arial" w:eastAsia="Arial" w:hAnsi="Arial"/>
-                <w:color w:val="1E293B"/>
-                <w:sz w:val="21"/>
-                <w:szCs w:val="21"/>
-              </w:rPr>
-              <w:t xml:space="preserve"> </w:t>
+              <w:t xml:space="preserve">Fuente 2</w:t>
             </w:r>
           </w:p>
           <w:p>
@@ -2645,7 +2575,7 @@
                 <w:sz w:val="18"/>
                 <w:szCs w:val="18"/>
               </w:rPr>
-              <w:t xml:space="preserve">Cita 3   (Molde A: Según ______ (año), …   ·   Molde B: … (Apellido, año).)</w:t>
+              <w:t xml:space="preserve">Fuente 3</w:t>
             </w:r>
           </w:p>
           <w:p>
@@ -2663,616 +2593,6 @@
                 <w:szCs w:val="21"/>
               </w:rPr>
               <w:t xml:space="preserve"> </w:t>
-            </w:r>
-          </w:p>
-          <w:p>
-            <w:pPr>
-              <w:pBdr>
-                <w:bottom w:val="dashed" w:color="9FB3C8" w:sz="6" w:space="1"/>
-              </w:pBdr>
-              <w:spacing w:after="0" w:before="0" w:line="420"/>
-            </w:pPr>
-            <w:r>
-              <w:rPr>
-                <w:rFonts w:ascii="Arial" w:cs="Arial" w:eastAsia="Arial" w:hAnsi="Arial"/>
-                <w:color w:val="1E293B"/>
-                <w:sz w:val="21"/>
-                <w:szCs w:val="21"/>
-              </w:rPr>
-              <w:t xml:space="preserve"> </w:t>
-            </w:r>
-          </w:p>
-        </w:tc>
-      </w:tr>
-    </w:tbl>
-    <w:p>
-      <w:pPr>
-        <w:spacing w:after="120" w:before="0" w:line="276"/>
-      </w:pPr>
-      <w:r>
-        <w:rPr>
-          <w:rFonts w:ascii="Arial" w:cs="Arial" w:eastAsia="Arial" w:hAnsi="Arial"/>
-          <w:color w:val="1E293B"/>
-          <w:sz w:val="21"/>
-          <w:szCs w:val="21"/>
-        </w:rPr>
-        <w:t xml:space="preserve"/>
-      </w:r>
-    </w:p>
-    <w:tbl>
-      <w:tblPr>
-        <w:tblW w:type="dxa" w:w="9638"/>
-        <w:tblBorders>
-          <w:top w:val="single" w:color="auto" w:sz="4"/>
-          <w:left w:val="single" w:color="auto" w:sz="4"/>
-          <w:bottom w:val="single" w:color="auto" w:sz="4"/>
-          <w:right w:val="single" w:color="auto" w:sz="4"/>
-          <w:insideH w:val="single" w:color="auto" w:sz="4"/>
-          <w:insideV w:val="single" w:color="auto" w:sz="4"/>
-        </w:tblBorders>
-      </w:tblPr>
-      <w:tblGrid>
-        <w:gridCol w:w="9638"/>
-      </w:tblGrid>
-      <w:tr>
-        <w:trPr>
-          <w:cantSplit/>
-        </w:trPr>
-        <w:tc>
-          <w:tcPr>
-            <w:tcW w:type="dxa" w:w="9638"/>
-            <w:tcBorders>
-              <w:top w:val="single" w:color="2563EB" w:sz="10"/>
-              <w:left w:val="single" w:color="2563EB" w:sz="10"/>
-              <w:bottom w:val="none" w:color="FFFFFF" w:sz="0"/>
-              <w:right w:val="single" w:color="2563EB" w:sz="10"/>
-            </w:tcBorders>
-            <w:shd w:fill="DBEAFE" w:color="auto" w:val="clear"/>
-            <w:tcMar>
-              <w:top w:type="dxa" w:w="110"/>
-              <w:left w:type="dxa" w:w="160"/>
-              <w:bottom w:type="dxa" w:w="110"/>
-              <w:right w:type="dxa" w:w="160"/>
-            </w:tcMar>
-          </w:tcPr>
-          <w:p>
-            <w:pPr>
-              <w:spacing w:after="20" w:before="0" w:line="276"/>
-            </w:pPr>
-            <w:r>
-              <w:rPr>
-                <w:rFonts w:ascii="Arial" w:cs="Arial" w:eastAsia="Arial" w:hAnsi="Arial"/>
-                <w:b/>
-                <w:bCs/>
-                <w:color w:val="2563EB"/>
-                <w:sz w:val="20"/>
-                <w:szCs w:val="20"/>
-              </w:rPr>
-              <w:t xml:space="preserve">PASO 10  </w:t>
-            </w:r>
-            <w:r>
-              <w:rPr>
-                <w:rFonts w:ascii="Arial" w:cs="Arial" w:eastAsia="Arial" w:hAnsi="Arial"/>
-                <w:b/>
-                <w:bCs/>
-                <w:color w:val="0B2E4F"/>
-                <w:sz w:val="26"/>
-                <w:szCs w:val="26"/>
-              </w:rPr>
-              <w:t xml:space="preserve">📚 Mis fuentes (Referencias APA)</w:t>
-            </w:r>
-          </w:p>
-          <w:p>
-            <w:pPr>
-              <w:spacing w:after="0" w:before="0" w:line="276"/>
-            </w:pPr>
-            <w:r>
-              <w:rPr>
-                <w:rFonts w:ascii="Arial" w:cs="Arial" w:eastAsia="Arial" w:hAnsi="Arial"/>
-                <w:color w:val="4B6075"/>
-                <w:sz w:val="18"/>
-                <w:szCs w:val="18"/>
-              </w:rPr>
-              <w:t xml:space="preserve">Escribe de dónde sacaste cada cita.</w:t>
-            </w:r>
-          </w:p>
-        </w:tc>
-      </w:tr>
-      <w:tr>
-        <w:tc>
-          <w:tcPr>
-            <w:tcW w:type="dxa" w:w="9638"/>
-            <w:tcBorders>
-              <w:top w:val="none" w:color="FFFFFF" w:sz="0"/>
-              <w:left w:val="single" w:color="2563EB" w:sz="10"/>
-              <w:bottom w:val="single" w:color="2563EB" w:sz="10"/>
-              <w:right w:val="single" w:color="2563EB" w:sz="10"/>
-            </w:tcBorders>
-            <w:tcMar>
-              <w:top w:type="dxa" w:w="110"/>
-              <w:left w:type="dxa" w:w="160"/>
-              <w:bottom w:type="dxa" w:w="110"/>
-              <w:right w:type="dxa" w:w="160"/>
-            </w:tcMar>
-          </w:tcPr>
-          <w:p>
-            <w:pPr>
-              <w:spacing w:after="80" w:before="40" w:line="276"/>
-            </w:pPr>
-            <w:r>
-              <w:rPr>
-                <w:rFonts w:ascii="Arial" w:cs="Arial" w:eastAsia="Arial" w:hAnsi="Arial"/>
-                <w:i/>
-                <w:iCs/>
-                <w:color w:val="64748B"/>
-                <w:sz w:val="17"/>
-                <w:szCs w:val="17"/>
-              </w:rPr>
-              <w:t xml:space="preserve">Orden: Autor o institución. (Año). Título. Página web o libro.</w:t>
-            </w:r>
-          </w:p>
-          <w:p>
-            <w:pPr>
-              <w:spacing w:after="80" w:before="40" w:line="276"/>
-            </w:pPr>
-            <w:r>
-              <w:rPr>
-                <w:rFonts w:ascii="Arial" w:cs="Arial" w:eastAsia="Arial" w:hAnsi="Arial"/>
-                <w:i/>
-                <w:iCs/>
-                <w:color w:val="64748B"/>
-                <w:sz w:val="17"/>
-                <w:szCs w:val="17"/>
-              </w:rPr>
-              <w:t xml:space="preserve">Ejemplo: Ministerio de Salud. (2025). Dengue: síntomas y prevención. gob.pe</w:t>
-            </w:r>
-          </w:p>
-          <w:p>
-            <w:pPr>
-              <w:spacing w:after="0" w:before="60" w:line="276"/>
-            </w:pPr>
-            <w:r>
-              <w:rPr>
-                <w:rFonts w:ascii="Arial" w:cs="Arial" w:eastAsia="Arial" w:hAnsi="Arial"/>
-                <w:b/>
-                <w:bCs/>
-                <w:color w:val="0B2E4F"/>
-                <w:sz w:val="18"/>
-                <w:szCs w:val="18"/>
-              </w:rPr>
-              <w:t xml:space="preserve">Fuente 1</w:t>
-            </w:r>
-          </w:p>
-          <w:p>
-            <w:pPr>
-              <w:pBdr>
-                <w:bottom w:val="dashed" w:color="9FB3C8" w:sz="6" w:space="1"/>
-              </w:pBdr>
-              <w:spacing w:after="0" w:before="0" w:line="420"/>
-            </w:pPr>
-            <w:r>
-              <w:rPr>
-                <w:rFonts w:ascii="Arial" w:cs="Arial" w:eastAsia="Arial" w:hAnsi="Arial"/>
-                <w:color w:val="1E293B"/>
-                <w:sz w:val="21"/>
-                <w:szCs w:val="21"/>
-              </w:rPr>
-              <w:t xml:space="preserve"> </w:t>
-            </w:r>
-          </w:p>
-          <w:p>
-            <w:pPr>
-              <w:spacing w:after="0" w:before="60" w:line="276"/>
-            </w:pPr>
-            <w:r>
-              <w:rPr>
-                <w:rFonts w:ascii="Arial" w:cs="Arial" w:eastAsia="Arial" w:hAnsi="Arial"/>
-                <w:b/>
-                <w:bCs/>
-                <w:color w:val="0B2E4F"/>
-                <w:sz w:val="18"/>
-                <w:szCs w:val="18"/>
-              </w:rPr>
-              <w:t xml:space="preserve">Fuente 2</w:t>
-            </w:r>
-          </w:p>
-          <w:p>
-            <w:pPr>
-              <w:pBdr>
-                <w:bottom w:val="dashed" w:color="9FB3C8" w:sz="6" w:space="1"/>
-              </w:pBdr>
-              <w:spacing w:after="0" w:before="0" w:line="420"/>
-            </w:pPr>
-            <w:r>
-              <w:rPr>
-                <w:rFonts w:ascii="Arial" w:cs="Arial" w:eastAsia="Arial" w:hAnsi="Arial"/>
-                <w:color w:val="1E293B"/>
-                <w:sz w:val="21"/>
-                <w:szCs w:val="21"/>
-              </w:rPr>
-              <w:t xml:space="preserve"> </w:t>
-            </w:r>
-          </w:p>
-          <w:p>
-            <w:pPr>
-              <w:spacing w:after="0" w:before="60" w:line="276"/>
-            </w:pPr>
-            <w:r>
-              <w:rPr>
-                <w:rFonts w:ascii="Arial" w:cs="Arial" w:eastAsia="Arial" w:hAnsi="Arial"/>
-                <w:b/>
-                <w:bCs/>
-                <w:color w:val="0B2E4F"/>
-                <w:sz w:val="18"/>
-                <w:szCs w:val="18"/>
-              </w:rPr>
-              <w:t xml:space="preserve">Fuente 3</w:t>
-            </w:r>
-          </w:p>
-          <w:p>
-            <w:pPr>
-              <w:pBdr>
-                <w:bottom w:val="dashed" w:color="9FB3C8" w:sz="6" w:space="1"/>
-              </w:pBdr>
-              <w:spacing w:after="0" w:before="0" w:line="420"/>
-            </w:pPr>
-            <w:r>
-              <w:rPr>
-                <w:rFonts w:ascii="Arial" w:cs="Arial" w:eastAsia="Arial" w:hAnsi="Arial"/>
-                <w:color w:val="1E293B"/>
-                <w:sz w:val="21"/>
-                <w:szCs w:val="21"/>
-              </w:rPr>
-              <w:t xml:space="preserve"> </w:t>
-            </w:r>
-          </w:p>
-        </w:tc>
-      </w:tr>
-    </w:tbl>
-    <w:p>
-      <w:pPr>
-        <w:spacing w:after="120" w:before="0" w:line="276"/>
-      </w:pPr>
-      <w:r>
-        <w:rPr>
-          <w:rFonts w:ascii="Arial" w:cs="Arial" w:eastAsia="Arial" w:hAnsi="Arial"/>
-          <w:color w:val="1E293B"/>
-          <w:sz w:val="21"/>
-          <w:szCs w:val="21"/>
-        </w:rPr>
-        <w:t xml:space="preserve"/>
-      </w:r>
-    </w:p>
-    <w:tbl>
-      <w:tblPr>
-        <w:tblW w:type="dxa" w:w="9638"/>
-        <w:tblBorders>
-          <w:top w:val="single" w:color="auto" w:sz="4"/>
-          <w:left w:val="single" w:color="auto" w:sz="4"/>
-          <w:bottom w:val="single" w:color="auto" w:sz="4"/>
-          <w:right w:val="single" w:color="auto" w:sz="4"/>
-          <w:insideH w:val="single" w:color="auto" w:sz="4"/>
-          <w:insideV w:val="single" w:color="auto" w:sz="4"/>
-        </w:tblBorders>
-      </w:tblPr>
-      <w:tblGrid>
-        <w:gridCol w:w="9638"/>
-      </w:tblGrid>
-      <w:tr>
-        <w:trPr>
-          <w:cantSplit/>
-        </w:trPr>
-        <w:tc>
-          <w:tcPr>
-            <w:tcW w:type="dxa" w:w="9638"/>
-            <w:tcBorders>
-              <w:top w:val="single" w:color="EA580C" w:sz="10"/>
-              <w:left w:val="single" w:color="EA580C" w:sz="10"/>
-              <w:bottom w:val="none" w:color="FFFFFF" w:sz="0"/>
-              <w:right w:val="single" w:color="EA580C" w:sz="10"/>
-            </w:tcBorders>
-            <w:shd w:fill="FFEDD5" w:color="auto" w:val="clear"/>
-            <w:tcMar>
-              <w:top w:type="dxa" w:w="110"/>
-              <w:left w:type="dxa" w:w="160"/>
-              <w:bottom w:type="dxa" w:w="110"/>
-              <w:right w:type="dxa" w:w="160"/>
-            </w:tcMar>
-          </w:tcPr>
-          <w:p>
-            <w:pPr>
-              <w:spacing w:after="20" w:before="0" w:line="276"/>
-            </w:pPr>
-            <w:r>
-              <w:rPr>
-                <w:rFonts w:ascii="Arial" w:cs="Arial" w:eastAsia="Arial" w:hAnsi="Arial"/>
-                <w:b/>
-                <w:bCs/>
-                <w:color w:val="EA580C"/>
-                <w:sz w:val="20"/>
-                <w:szCs w:val="20"/>
-              </w:rPr>
-              <w:t xml:space="preserve">PASO 11  </w:t>
-            </w:r>
-            <w:r>
-              <w:rPr>
-                <w:rFonts w:ascii="Arial" w:cs="Arial" w:eastAsia="Arial" w:hAnsi="Arial"/>
-                <w:b/>
-                <w:bCs/>
-                <w:color w:val="0B2E4F"/>
-                <w:sz w:val="26"/>
-                <w:szCs w:val="26"/>
-              </w:rPr>
-              <w:t xml:space="preserve">🔑 Palabras clave</w:t>
-            </w:r>
-          </w:p>
-          <w:p>
-            <w:pPr>
-              <w:spacing w:after="0" w:before="0" w:line="276"/>
-            </w:pPr>
-            <w:r>
-              <w:rPr>
-                <w:rFonts w:ascii="Arial" w:cs="Arial" w:eastAsia="Arial" w:hAnsi="Arial"/>
-                <w:color w:val="4B6075"/>
-                <w:sz w:val="18"/>
-                <w:szCs w:val="18"/>
-              </w:rPr>
-              <w:t xml:space="preserve">De 3 a 5 palabras: con ellas te encontrarán en el 🔍 Buscador de la Revista.</w:t>
-            </w:r>
-          </w:p>
-        </w:tc>
-      </w:tr>
-      <w:tr>
-        <w:tc>
-          <w:tcPr>
-            <w:tcW w:type="dxa" w:w="9638"/>
-            <w:tcBorders>
-              <w:top w:val="none" w:color="FFFFFF" w:sz="0"/>
-              <w:left w:val="single" w:color="EA580C" w:sz="10"/>
-              <w:bottom w:val="single" w:color="EA580C" w:sz="10"/>
-              <w:right w:val="single" w:color="EA580C" w:sz="10"/>
-            </w:tcBorders>
-            <w:tcMar>
-              <w:top w:type="dxa" w:w="110"/>
-              <w:left w:type="dxa" w:w="160"/>
-              <w:bottom w:type="dxa" w:w="110"/>
-              <w:right w:type="dxa" w:w="160"/>
-            </w:tcMar>
-          </w:tcPr>
-          <w:p>
-            <w:pPr>
-              <w:spacing w:after="40" w:before="0" w:line="276"/>
-            </w:pPr>
-            <w:r>
-              <w:rPr>
-                <w:rFonts w:ascii="Arial" w:cs="Arial" w:eastAsia="Arial" w:hAnsi="Arial"/>
-                <w:color w:val="1E293B"/>
-                <w:sz w:val="21"/>
-                <w:szCs w:val="21"/>
-              </w:rPr>
-              <w:t xml:space="preserve">1. ____________   2. ____________   3. ____________   4. ____________   5. ____________</w:t>
-            </w:r>
-          </w:p>
-        </w:tc>
-      </w:tr>
-    </w:tbl>
-    <w:p>
-      <w:pPr>
-        <w:spacing w:after="120" w:before="0" w:line="276"/>
-      </w:pPr>
-      <w:r>
-        <w:rPr>
-          <w:rFonts w:ascii="Arial" w:cs="Arial" w:eastAsia="Arial" w:hAnsi="Arial"/>
-          <w:color w:val="1E293B"/>
-          <w:sz w:val="21"/>
-          <w:szCs w:val="21"/>
-        </w:rPr>
-        <w:t xml:space="preserve"/>
-      </w:r>
-    </w:p>
-    <w:tbl>
-      <w:tblPr>
-        <w:tblW w:type="dxa" w:w="9638"/>
-        <w:tblBorders>
-          <w:top w:val="single" w:color="auto" w:sz="4"/>
-          <w:left w:val="single" w:color="auto" w:sz="4"/>
-          <w:bottom w:val="single" w:color="auto" w:sz="4"/>
-          <w:right w:val="single" w:color="auto" w:sz="4"/>
-          <w:insideH w:val="single" w:color="auto" w:sz="4"/>
-          <w:insideV w:val="single" w:color="auto" w:sz="4"/>
-        </w:tblBorders>
-      </w:tblPr>
-      <w:tblGrid>
-        <w:gridCol w:w="9638"/>
-      </w:tblGrid>
-      <w:tr>
-        <w:trPr>
-          <w:cantSplit/>
-        </w:trPr>
-        <w:tc>
-          <w:tcPr>
-            <w:tcW w:type="dxa" w:w="9638"/>
-            <w:tcBorders>
-              <w:top w:val="single" w:color="0891B2" w:sz="10"/>
-              <w:left w:val="single" w:color="0891B2" w:sz="10"/>
-              <w:bottom w:val="none" w:color="FFFFFF" w:sz="0"/>
-              <w:right w:val="single" w:color="0891B2" w:sz="10"/>
-            </w:tcBorders>
-            <w:shd w:fill="CFFAFE" w:color="auto" w:val="clear"/>
-            <w:tcMar>
-              <w:top w:type="dxa" w:w="110"/>
-              <w:left w:type="dxa" w:w="160"/>
-              <w:bottom w:type="dxa" w:w="110"/>
-              <w:right w:type="dxa" w:w="160"/>
-            </w:tcMar>
-          </w:tcPr>
-          <w:p>
-            <w:pPr>
-              <w:spacing w:after="20" w:before="0" w:line="276"/>
-            </w:pPr>
-            <w:r>
-              <w:rPr>
-                <w:rFonts w:ascii="Arial" w:cs="Arial" w:eastAsia="Arial" w:hAnsi="Arial"/>
-                <w:b/>
-                <w:bCs/>
-                <w:color w:val="0891B2"/>
-                <w:sz w:val="20"/>
-                <w:szCs w:val="20"/>
-              </w:rPr>
-              <w:t xml:space="preserve">PASO 12  </w:t>
-            </w:r>
-            <w:r>
-              <w:rPr>
-                <w:rFonts w:ascii="Arial" w:cs="Arial" w:eastAsia="Arial" w:hAnsi="Arial"/>
-                <w:b/>
-                <w:bCs/>
-                <w:color w:val="0B2E4F"/>
-                <w:sz w:val="26"/>
-                <w:szCs w:val="26"/>
-              </w:rPr>
-              <w:t xml:space="preserve">✅ Revisa y publica</w:t>
-            </w:r>
-          </w:p>
-          <w:p>
-            <w:pPr>
-              <w:spacing w:after="0" w:before="0" w:line="276"/>
-            </w:pPr>
-            <w:r>
-              <w:rPr>
-                <w:rFonts w:ascii="Arial" w:cs="Arial" w:eastAsia="Arial" w:hAnsi="Arial"/>
-                <w:color w:val="4B6075"/>
-                <w:sz w:val="18"/>
-                <w:szCs w:val="18"/>
-              </w:rPr>
-              <w:t xml:space="preserve">Marca cada casilla antes de publicar.</w:t>
-            </w:r>
-          </w:p>
-        </w:tc>
-      </w:tr>
-      <w:tr>
-        <w:tc>
-          <w:tcPr>
-            <w:tcW w:type="dxa" w:w="9638"/>
-            <w:tcBorders>
-              <w:top w:val="none" w:color="FFFFFF" w:sz="0"/>
-              <w:left w:val="single" w:color="0891B2" w:sz="10"/>
-              <w:bottom w:val="single" w:color="0891B2" w:sz="10"/>
-              <w:right w:val="single" w:color="0891B2" w:sz="10"/>
-            </w:tcBorders>
-            <w:tcMar>
-              <w:top w:type="dxa" w:w="110"/>
-              <w:left w:type="dxa" w:w="160"/>
-              <w:bottom w:type="dxa" w:w="110"/>
-              <w:right w:type="dxa" w:w="160"/>
-            </w:tcMar>
-          </w:tcPr>
-          <w:p>
-            <w:pPr>
-              <w:spacing w:after="30" w:before="0" w:line="276"/>
-            </w:pPr>
-            <w:r>
-              <w:rPr>
-                <w:rFonts w:ascii="Arial" w:cs="Arial" w:eastAsia="Arial" w:hAnsi="Arial"/>
-                <w:color w:val="1E293B"/>
-                <w:sz w:val="21"/>
-                <w:szCs w:val="21"/>
-              </w:rPr>
-              <w:t xml:space="preserve">☐  Completé los datos y el título.</w:t>
-            </w:r>
-          </w:p>
-          <w:p>
-            <w:pPr>
-              <w:spacing w:after="30" w:before="0" w:line="276"/>
-            </w:pPr>
-            <w:r>
-              <w:rPr>
-                <w:rFonts w:ascii="Arial" w:cs="Arial" w:eastAsia="Arial" w:hAnsi="Arial"/>
-                <w:color w:val="1E293B"/>
-                <w:sz w:val="21"/>
-                <w:szCs w:val="21"/>
-              </w:rPr>
-              <w:t xml:space="preserve">☐  Tiene pregunta, hipótesis, variables, materiales, pasos y tabla.</w:t>
-            </w:r>
-          </w:p>
-          <w:p>
-            <w:pPr>
-              <w:spacing w:after="30" w:before="0" w:line="276"/>
-            </w:pPr>
-            <w:r>
-              <w:rPr>
-                <w:rFonts w:ascii="Arial" w:cs="Arial" w:eastAsia="Arial" w:hAnsi="Arial"/>
-                <w:color w:val="1E293B"/>
-                <w:sz w:val="21"/>
-                <w:szCs w:val="21"/>
-              </w:rPr>
-              <w:t xml:space="preserve">☐  Tiene mis 3 citas con mis palabras.</w:t>
-            </w:r>
-          </w:p>
-          <w:p>
-            <w:pPr>
-              <w:spacing w:after="30" w:before="0" w:line="276"/>
-            </w:pPr>
-            <w:r>
-              <w:rPr>
-                <w:rFonts w:ascii="Arial" w:cs="Arial" w:eastAsia="Arial" w:hAnsi="Arial"/>
-                <w:color w:val="1E293B"/>
-                <w:sz w:val="21"/>
-                <w:szCs w:val="21"/>
-              </w:rPr>
-              <w:t xml:space="preserve">☐  Escribí las 3 fuentes.</w:t>
-            </w:r>
-          </w:p>
-          <w:p>
-            <w:pPr>
-              <w:spacing w:after="30" w:before="0" w:line="276"/>
-            </w:pPr>
-            <w:r>
-              <w:rPr>
-                <w:rFonts w:ascii="Arial" w:cs="Arial" w:eastAsia="Arial" w:hAnsi="Arial"/>
-                <w:color w:val="1E293B"/>
-                <w:sz w:val="21"/>
-                <w:szCs w:val="21"/>
-              </w:rPr>
-              <w:t xml:space="preserve">☐  Elegí de 3 a 5 palabras clave.</w:t>
-            </w:r>
-          </w:p>
-          <w:p>
-            <w:pPr>
-              <w:spacing w:after="30" w:before="0" w:line="276"/>
-            </w:pPr>
-            <w:r>
-              <w:rPr>
-                <w:rFonts w:ascii="Arial" w:cs="Arial" w:eastAsia="Arial" w:hAnsi="Arial"/>
-                <w:color w:val="1E293B"/>
-                <w:sz w:val="21"/>
-                <w:szCs w:val="21"/>
-              </w:rPr>
-              <w:t xml:space="preserve">☐  Revisé la ortografía y lo leí en voz alta.</w:t>
-            </w:r>
-          </w:p>
-          <w:p>
-            <w:pPr>
-              <w:spacing w:after="0" w:before="80" w:line="276"/>
-            </w:pPr>
-            <w:r>
-              <w:rPr>
-                <w:rFonts w:ascii="Arial" w:cs="Arial" w:eastAsia="Arial" w:hAnsi="Arial"/>
-                <w:b/>
-                <w:bCs/>
-                <w:color w:val="15803D"/>
-                <w:sz w:val="21"/>
-                <w:szCs w:val="21"/>
-              </w:rPr>
-              <w:t xml:space="preserve">¿Cómo lo publico? </w:t>
-            </w:r>
-            <w:r>
-              <w:rPr>
-                <w:rFonts w:ascii="Arial" w:cs="Arial" w:eastAsia="Arial" w:hAnsi="Arial"/>
-                <w:color w:val="1E293B"/>
-                <w:sz w:val="21"/>
-                <w:szCs w:val="21"/>
-              </w:rPr>
-              <w:t xml:space="preserve">Guarda este Word. En la Revista entra a 📝 Publicar propuesta, escribe el título, elige el tipo, pon tus palabras clave, sube esta guía y, si quieres, hasta 3 fotos (irán como Anexos).</w:t>
             </w:r>
           </w:p>
         </w:tc>

</xml_diff>

<commit_message>
Guías: pista arriba y un recuadro libre para escribir; sin emojis (se veían como cuadraditos); vuelve «Revisa y publica» adaptado a cada tipo
Co-Authored-By: Claude Opus 5.5 <noreply@anthropic.com>
Claude-Session: https://claude.ai/code/session_01GLj1XaXL3zPjkcPgbeyeYx
</commit_message>
<xml_diff>
--- a/docs/guias/dis.docx
+++ b/docs/guias/dis.docx
@@ -64,7 +64,7 @@
                 <w:sz w:val="40"/>
                 <w:szCs w:val="40"/>
               </w:rPr>
-              <w:t xml:space="preserve">🧪 Diseño de investigación</w:t>
+              <w:t xml:space="preserve"> Diseño de investigación</w:t>
             </w:r>
           </w:p>
           <w:p>
@@ -94,7 +94,7 @@
                 <w:sz w:val="18"/>
                 <w:szCs w:val="18"/>
               </w:rPr>
-              <w:t xml:space="preserve">✍️ Usa mínimo 3 citas parafraseadas dentro de tu trabajo y escribe sus fuentes al final.</w:t>
+              <w:t xml:space="preserve"> Usa mínimo 3 citas parafraseadas dentro de tu trabajo y escribe sus fuentes al final.</w:t>
             </w:r>
           </w:p>
         </w:tc>
@@ -163,7 +163,7 @@
                 <w:sz w:val="20"/>
                 <w:szCs w:val="20"/>
               </w:rPr>
-              <w:t xml:space="preserve">PASO 1  </w:t>
+              <w:t xml:space="preserve">PASO 1 </w:t>
             </w:r>
             <w:r>
               <w:rPr>
@@ -174,7 +174,7 @@
                 <w:sz w:val="26"/>
                 <w:szCs w:val="26"/>
               </w:rPr>
-              <w:t xml:space="preserve">❓ Pregunta de indagación</w:t>
+              <w:t xml:space="preserve"> Pregunta de indagación</w:t>
             </w:r>
           </w:p>
           <w:p>
@@ -212,10 +212,87 @@
           </w:tcPr>
           <w:p>
             <w:pPr>
-              <w:pBdr>
-                <w:bottom w:val="dashed" w:color="9FB3C8" w:sz="6" w:space="1"/>
-              </w:pBdr>
-              <w:spacing w:after="0" w:before="0" w:line="420"/>
+              <w:spacing w:after="60" w:before="40" w:line="276"/>
+            </w:pPr>
+            <w:r>
+              <w:rPr>
+                <w:rFonts w:ascii="Arial" w:cs="Arial" w:eastAsia="Arial" w:hAnsi="Arial"/>
+                <w:i/>
+                <w:iCs/>
+                <w:color w:val="8A6100"/>
+                <w:sz w:val="18"/>
+                <w:szCs w:val="18"/>
+              </w:rPr>
+              <w:t xml:space="preserve">Ejemplo: ¿Cómo influye la temperatura del agua en la actividad de la levadura?</w:t>
+            </w:r>
+          </w:p>
+          <w:tbl>
+            <w:tblPr>
+              <w:tblW w:type="dxa" w:w="9318"/>
+              <w:tblBorders>
+                <w:top w:val="single" w:color="auto" w:sz="4"/>
+                <w:left w:val="single" w:color="auto" w:sz="4"/>
+                <w:bottom w:val="single" w:color="auto" w:sz="4"/>
+                <w:right w:val="single" w:color="auto" w:sz="4"/>
+                <w:insideH w:val="single" w:color="auto" w:sz="4"/>
+                <w:insideV w:val="single" w:color="auto" w:sz="4"/>
+              </w:tblBorders>
+            </w:tblPr>
+            <w:tblGrid>
+              <w:gridCol w:w="9318"/>
+            </w:tblGrid>
+            <w:tr>
+              <w:tc>
+                <w:tcPr>
+                  <w:tcW w:type="dxa" w:w="9318"/>
+                  <w:tcBorders>
+                    <w:top w:val="single" w:color="93C5FD" w:sz="8"/>
+                    <w:left w:val="single" w:color="93C5FD" w:sz="8"/>
+                    <w:bottom w:val="single" w:color="93C5FD" w:sz="8"/>
+                    <w:right w:val="single" w:color="93C5FD" w:sz="8"/>
+                  </w:tcBorders>
+                  <w:shd w:fill="F8FBFF" w:color="auto" w:val="clear"/>
+                  <w:tcMar>
+                    <w:top w:type="dxa" w:w="80"/>
+                    <w:left w:type="dxa" w:w="140"/>
+                    <w:bottom w:type="dxa" w:w="80"/>
+                    <w:right w:type="dxa" w:w="140"/>
+                  </w:tcMar>
+                </w:tcPr>
+                <w:p>
+                  <w:pPr>
+                    <w:spacing w:after="0" w:before="0" w:line="420"/>
+                  </w:pPr>
+                  <w:r>
+                    <w:rPr>
+                      <w:rFonts w:ascii="Arial" w:cs="Arial" w:eastAsia="Arial" w:hAnsi="Arial"/>
+                      <w:color w:val="1E293B"/>
+                      <w:sz w:val="21"/>
+                      <w:szCs w:val="21"/>
+                    </w:rPr>
+                    <w:t xml:space="preserve"> </w:t>
+                  </w:r>
+                </w:p>
+                <w:p>
+                  <w:pPr>
+                    <w:spacing w:after="0" w:before="0" w:line="420"/>
+                  </w:pPr>
+                  <w:r>
+                    <w:rPr>
+                      <w:rFonts w:ascii="Arial" w:cs="Arial" w:eastAsia="Arial" w:hAnsi="Arial"/>
+                      <w:color w:val="1E293B"/>
+                      <w:sz w:val="21"/>
+                      <w:szCs w:val="21"/>
+                    </w:rPr>
+                    <w:t xml:space="preserve"> </w:t>
+                  </w:r>
+                </w:p>
+              </w:tc>
+            </w:tr>
+          </w:tbl>
+          <w:p>
+            <w:pPr>
+              <w:spacing w:after="60" w:before="0" w:line="276"/>
             </w:pPr>
             <w:r>
               <w:rPr>
@@ -224,40 +301,7 @@
                 <w:sz w:val="21"/>
                 <w:szCs w:val="21"/>
               </w:rPr>
-              <w:t xml:space="preserve"> </w:t>
-            </w:r>
-          </w:p>
-          <w:p>
-            <w:pPr>
-              <w:pBdr>
-                <w:bottom w:val="dashed" w:color="9FB3C8" w:sz="6" w:space="1"/>
-              </w:pBdr>
-              <w:spacing w:after="0" w:before="0" w:line="420"/>
-            </w:pPr>
-            <w:r>
-              <w:rPr>
-                <w:rFonts w:ascii="Arial" w:cs="Arial" w:eastAsia="Arial" w:hAnsi="Arial"/>
-                <w:color w:val="1E293B"/>
-                <w:sz w:val="21"/>
-                <w:szCs w:val="21"/>
-              </w:rPr>
-              <w:t xml:space="preserve"> </w:t>
-            </w:r>
-          </w:p>
-          <w:p>
-            <w:pPr>
-              <w:spacing w:after="80" w:before="40" w:line="276"/>
-            </w:pPr>
-            <w:r>
-              <w:rPr>
-                <w:rFonts w:ascii="Arial" w:cs="Arial" w:eastAsia="Arial" w:hAnsi="Arial"/>
-                <w:i/>
-                <w:iCs/>
-                <w:color w:val="64748B"/>
-                <w:sz w:val="17"/>
-                <w:szCs w:val="17"/>
-              </w:rPr>
-              <w:t xml:space="preserve">Ejemplo: ¿Cómo influye la temperatura del agua en la actividad de la levadura?</w:t>
+              <w:t xml:space="preserve"/>
             </w:r>
           </w:p>
         </w:tc>
@@ -326,7 +370,7 @@
                 <w:sz w:val="20"/>
                 <w:szCs w:val="20"/>
               </w:rPr>
-              <w:t xml:space="preserve">PASO 2  </w:t>
+              <w:t xml:space="preserve">PASO 2 </w:t>
             </w:r>
             <w:r>
               <w:rPr>
@@ -337,7 +381,7 @@
                 <w:sz w:val="26"/>
                 <w:szCs w:val="26"/>
               </w:rPr>
-              <w:t xml:space="preserve">📖 ¿Qué dice la ciencia?</w:t>
+              <w:t xml:space="preserve"> ¿Qué dice la ciencia?</w:t>
             </w:r>
           </w:p>
           <w:p>
@@ -351,7 +395,7 @@
                 <w:sz w:val="18"/>
                 <w:szCs w:val="18"/>
               </w:rPr>
-              <w:t xml:space="preserve">Lo que encontraste en fuentes confiables sobre tu tema. ✍️ Aquí van tus 3 citas: «Según López (2020), …» o «… (Soto, 2019)».</w:t>
+              <w:t xml:space="preserve">Lo que encontraste en fuentes confiables sobre tu tema. Aquí van tus 3 citas: «Según López (2020), …» o «… (Soto, 2019)».</w:t>
             </w:r>
           </w:p>
         </w:tc>
@@ -373,12 +417,115 @@
               <w:right w:type="dxa" w:w="160"/>
             </w:tcMar>
           </w:tcPr>
-          <w:p>
-            <w:pPr>
-              <w:pBdr>
-                <w:bottom w:val="dashed" w:color="9FB3C8" w:sz="6" w:space="1"/>
-              </w:pBdr>
-              <w:spacing w:after="0" w:before="0" w:line="420"/>
+          <w:tbl>
+            <w:tblPr>
+              <w:tblW w:type="dxa" w:w="9318"/>
+              <w:tblBorders>
+                <w:top w:val="single" w:color="auto" w:sz="4"/>
+                <w:left w:val="single" w:color="auto" w:sz="4"/>
+                <w:bottom w:val="single" w:color="auto" w:sz="4"/>
+                <w:right w:val="single" w:color="auto" w:sz="4"/>
+                <w:insideH w:val="single" w:color="auto" w:sz="4"/>
+                <w:insideV w:val="single" w:color="auto" w:sz="4"/>
+              </w:tblBorders>
+            </w:tblPr>
+            <w:tblGrid>
+              <w:gridCol w:w="9318"/>
+            </w:tblGrid>
+            <w:tr>
+              <w:tc>
+                <w:tcPr>
+                  <w:tcW w:type="dxa" w:w="9318"/>
+                  <w:tcBorders>
+                    <w:top w:val="single" w:color="93C5FD" w:sz="8"/>
+                    <w:left w:val="single" w:color="93C5FD" w:sz="8"/>
+                    <w:bottom w:val="single" w:color="93C5FD" w:sz="8"/>
+                    <w:right w:val="single" w:color="93C5FD" w:sz="8"/>
+                  </w:tcBorders>
+                  <w:shd w:fill="F8FBFF" w:color="auto" w:val="clear"/>
+                  <w:tcMar>
+                    <w:top w:type="dxa" w:w="80"/>
+                    <w:left w:type="dxa" w:w="140"/>
+                    <w:bottom w:type="dxa" w:w="80"/>
+                    <w:right w:type="dxa" w:w="140"/>
+                  </w:tcMar>
+                </w:tcPr>
+                <w:p>
+                  <w:pPr>
+                    <w:spacing w:after="0" w:before="0" w:line="420"/>
+                  </w:pPr>
+                  <w:r>
+                    <w:rPr>
+                      <w:rFonts w:ascii="Arial" w:cs="Arial" w:eastAsia="Arial" w:hAnsi="Arial"/>
+                      <w:color w:val="1E293B"/>
+                      <w:sz w:val="21"/>
+                      <w:szCs w:val="21"/>
+                    </w:rPr>
+                    <w:t xml:space="preserve"> </w:t>
+                  </w:r>
+                </w:p>
+                <w:p>
+                  <w:pPr>
+                    <w:spacing w:after="0" w:before="0" w:line="420"/>
+                  </w:pPr>
+                  <w:r>
+                    <w:rPr>
+                      <w:rFonts w:ascii="Arial" w:cs="Arial" w:eastAsia="Arial" w:hAnsi="Arial"/>
+                      <w:color w:val="1E293B"/>
+                      <w:sz w:val="21"/>
+                      <w:szCs w:val="21"/>
+                    </w:rPr>
+                    <w:t xml:space="preserve"> </w:t>
+                  </w:r>
+                </w:p>
+                <w:p>
+                  <w:pPr>
+                    <w:spacing w:after="0" w:before="0" w:line="420"/>
+                  </w:pPr>
+                  <w:r>
+                    <w:rPr>
+                      <w:rFonts w:ascii="Arial" w:cs="Arial" w:eastAsia="Arial" w:hAnsi="Arial"/>
+                      <w:color w:val="1E293B"/>
+                      <w:sz w:val="21"/>
+                      <w:szCs w:val="21"/>
+                    </w:rPr>
+                    <w:t xml:space="preserve"> </w:t>
+                  </w:r>
+                </w:p>
+                <w:p>
+                  <w:pPr>
+                    <w:spacing w:after="0" w:before="0" w:line="420"/>
+                  </w:pPr>
+                  <w:r>
+                    <w:rPr>
+                      <w:rFonts w:ascii="Arial" w:cs="Arial" w:eastAsia="Arial" w:hAnsi="Arial"/>
+                      <w:color w:val="1E293B"/>
+                      <w:sz w:val="21"/>
+                      <w:szCs w:val="21"/>
+                    </w:rPr>
+                    <w:t xml:space="preserve"> </w:t>
+                  </w:r>
+                </w:p>
+                <w:p>
+                  <w:pPr>
+                    <w:spacing w:after="0" w:before="0" w:line="420"/>
+                  </w:pPr>
+                  <w:r>
+                    <w:rPr>
+                      <w:rFonts w:ascii="Arial" w:cs="Arial" w:eastAsia="Arial" w:hAnsi="Arial"/>
+                      <w:color w:val="1E293B"/>
+                      <w:sz w:val="21"/>
+                      <w:szCs w:val="21"/>
+                    </w:rPr>
+                    <w:t xml:space="preserve"> </w:t>
+                  </w:r>
+                </w:p>
+              </w:tc>
+            </w:tr>
+          </w:tbl>
+          <w:p>
+            <w:pPr>
+              <w:spacing w:after="60" w:before="0" w:line="276"/>
             </w:pPr>
             <w:r>
               <w:rPr>
@@ -387,75 +534,7 @@
                 <w:sz w:val="21"/>
                 <w:szCs w:val="21"/>
               </w:rPr>
-              <w:t xml:space="preserve"> </w:t>
-            </w:r>
-          </w:p>
-          <w:p>
-            <w:pPr>
-              <w:pBdr>
-                <w:bottom w:val="dashed" w:color="9FB3C8" w:sz="6" w:space="1"/>
-              </w:pBdr>
-              <w:spacing w:after="0" w:before="0" w:line="420"/>
-            </w:pPr>
-            <w:r>
-              <w:rPr>
-                <w:rFonts w:ascii="Arial" w:cs="Arial" w:eastAsia="Arial" w:hAnsi="Arial"/>
-                <w:color w:val="1E293B"/>
-                <w:sz w:val="21"/>
-                <w:szCs w:val="21"/>
-              </w:rPr>
-              <w:t xml:space="preserve"> </w:t>
-            </w:r>
-          </w:p>
-          <w:p>
-            <w:pPr>
-              <w:pBdr>
-                <w:bottom w:val="dashed" w:color="9FB3C8" w:sz="6" w:space="1"/>
-              </w:pBdr>
-              <w:spacing w:after="0" w:before="0" w:line="420"/>
-            </w:pPr>
-            <w:r>
-              <w:rPr>
-                <w:rFonts w:ascii="Arial" w:cs="Arial" w:eastAsia="Arial" w:hAnsi="Arial"/>
-                <w:color w:val="1E293B"/>
-                <w:sz w:val="21"/>
-                <w:szCs w:val="21"/>
-              </w:rPr>
-              <w:t xml:space="preserve"> </w:t>
-            </w:r>
-          </w:p>
-          <w:p>
-            <w:pPr>
-              <w:pBdr>
-                <w:bottom w:val="dashed" w:color="9FB3C8" w:sz="6" w:space="1"/>
-              </w:pBdr>
-              <w:spacing w:after="0" w:before="0" w:line="420"/>
-            </w:pPr>
-            <w:r>
-              <w:rPr>
-                <w:rFonts w:ascii="Arial" w:cs="Arial" w:eastAsia="Arial" w:hAnsi="Arial"/>
-                <w:color w:val="1E293B"/>
-                <w:sz w:val="21"/>
-                <w:szCs w:val="21"/>
-              </w:rPr>
-              <w:t xml:space="preserve"> </w:t>
-            </w:r>
-          </w:p>
-          <w:p>
-            <w:pPr>
-              <w:pBdr>
-                <w:bottom w:val="dashed" w:color="9FB3C8" w:sz="6" w:space="1"/>
-              </w:pBdr>
-              <w:spacing w:after="0" w:before="0" w:line="420"/>
-            </w:pPr>
-            <w:r>
-              <w:rPr>
-                <w:rFonts w:ascii="Arial" w:cs="Arial" w:eastAsia="Arial" w:hAnsi="Arial"/>
-                <w:color w:val="1E293B"/>
-                <w:sz w:val="21"/>
-                <w:szCs w:val="21"/>
-              </w:rPr>
-              <w:t xml:space="preserve"> </w:t>
+              <w:t xml:space="preserve"/>
             </w:r>
           </w:p>
         </w:tc>
@@ -524,7 +603,7 @@
                 <w:sz w:val="20"/>
                 <w:szCs w:val="20"/>
               </w:rPr>
-              <w:t xml:space="preserve">PASO 3  </w:t>
+              <w:t xml:space="preserve">PASO 3 </w:t>
             </w:r>
             <w:r>
               <w:rPr>
@@ -535,7 +614,7 @@
                 <w:sz w:val="26"/>
                 <w:szCs w:val="26"/>
               </w:rPr>
-              <w:t xml:space="preserve">🔮 Hipótesis</w:t>
+              <w:t xml:space="preserve"> Hipótesis</w:t>
             </w:r>
           </w:p>
           <w:p>
@@ -587,12 +666,59 @@
               <w:t xml:space="preserve">Si </w:t>
             </w:r>
           </w:p>
-          <w:p>
-            <w:pPr>
-              <w:pBdr>
-                <w:bottom w:val="dashed" w:color="9FB3C8" w:sz="6" w:space="1"/>
-              </w:pBdr>
-              <w:spacing w:after="0" w:before="0" w:line="420"/>
+          <w:tbl>
+            <w:tblPr>
+              <w:tblW w:type="dxa" w:w="9318"/>
+              <w:tblBorders>
+                <w:top w:val="single" w:color="auto" w:sz="4"/>
+                <w:left w:val="single" w:color="auto" w:sz="4"/>
+                <w:bottom w:val="single" w:color="auto" w:sz="4"/>
+                <w:right w:val="single" w:color="auto" w:sz="4"/>
+                <w:insideH w:val="single" w:color="auto" w:sz="4"/>
+                <w:insideV w:val="single" w:color="auto" w:sz="4"/>
+              </w:tblBorders>
+            </w:tblPr>
+            <w:tblGrid>
+              <w:gridCol w:w="9318"/>
+            </w:tblGrid>
+            <w:tr>
+              <w:tc>
+                <w:tcPr>
+                  <w:tcW w:type="dxa" w:w="9318"/>
+                  <w:tcBorders>
+                    <w:top w:val="single" w:color="93C5FD" w:sz="8"/>
+                    <w:left w:val="single" w:color="93C5FD" w:sz="8"/>
+                    <w:bottom w:val="single" w:color="93C5FD" w:sz="8"/>
+                    <w:right w:val="single" w:color="93C5FD" w:sz="8"/>
+                  </w:tcBorders>
+                  <w:shd w:fill="F8FBFF" w:color="auto" w:val="clear"/>
+                  <w:tcMar>
+                    <w:top w:type="dxa" w:w="80"/>
+                    <w:left w:type="dxa" w:w="140"/>
+                    <w:bottom w:type="dxa" w:w="80"/>
+                    <w:right w:type="dxa" w:w="140"/>
+                  </w:tcMar>
+                </w:tcPr>
+                <w:p>
+                  <w:pPr>
+                    <w:spacing w:after="0" w:before="0" w:line="420"/>
+                  </w:pPr>
+                  <w:r>
+                    <w:rPr>
+                      <w:rFonts w:ascii="Arial" w:cs="Arial" w:eastAsia="Arial" w:hAnsi="Arial"/>
+                      <w:color w:val="1E293B"/>
+                      <w:sz w:val="21"/>
+                      <w:szCs w:val="21"/>
+                    </w:rPr>
+                    <w:t xml:space="preserve"> </w:t>
+                  </w:r>
+                </w:p>
+              </w:tc>
+            </w:tr>
+          </w:tbl>
+          <w:p>
+            <w:pPr>
+              <w:spacing w:after="60" w:before="0" w:line="276"/>
             </w:pPr>
             <w:r>
               <w:rPr>
@@ -601,7 +727,7 @@
                 <w:sz w:val="21"/>
                 <w:szCs w:val="21"/>
               </w:rPr>
-              <w:t xml:space="preserve"> </w:t>
+              <w:t xml:space="preserve"/>
             </w:r>
           </w:p>
           <w:p>
@@ -620,12 +746,59 @@
               <w:t xml:space="preserve">entonces </w:t>
             </w:r>
           </w:p>
-          <w:p>
-            <w:pPr>
-              <w:pBdr>
-                <w:bottom w:val="dashed" w:color="9FB3C8" w:sz="6" w:space="1"/>
-              </w:pBdr>
-              <w:spacing w:after="0" w:before="0" w:line="420"/>
+          <w:tbl>
+            <w:tblPr>
+              <w:tblW w:type="dxa" w:w="9318"/>
+              <w:tblBorders>
+                <w:top w:val="single" w:color="auto" w:sz="4"/>
+                <w:left w:val="single" w:color="auto" w:sz="4"/>
+                <w:bottom w:val="single" w:color="auto" w:sz="4"/>
+                <w:right w:val="single" w:color="auto" w:sz="4"/>
+                <w:insideH w:val="single" w:color="auto" w:sz="4"/>
+                <w:insideV w:val="single" w:color="auto" w:sz="4"/>
+              </w:tblBorders>
+            </w:tblPr>
+            <w:tblGrid>
+              <w:gridCol w:w="9318"/>
+            </w:tblGrid>
+            <w:tr>
+              <w:tc>
+                <w:tcPr>
+                  <w:tcW w:type="dxa" w:w="9318"/>
+                  <w:tcBorders>
+                    <w:top w:val="single" w:color="93C5FD" w:sz="8"/>
+                    <w:left w:val="single" w:color="93C5FD" w:sz="8"/>
+                    <w:bottom w:val="single" w:color="93C5FD" w:sz="8"/>
+                    <w:right w:val="single" w:color="93C5FD" w:sz="8"/>
+                  </w:tcBorders>
+                  <w:shd w:fill="F8FBFF" w:color="auto" w:val="clear"/>
+                  <w:tcMar>
+                    <w:top w:type="dxa" w:w="80"/>
+                    <w:left w:type="dxa" w:w="140"/>
+                    <w:bottom w:type="dxa" w:w="80"/>
+                    <w:right w:type="dxa" w:w="140"/>
+                  </w:tcMar>
+                </w:tcPr>
+                <w:p>
+                  <w:pPr>
+                    <w:spacing w:after="0" w:before="0" w:line="420"/>
+                  </w:pPr>
+                  <w:r>
+                    <w:rPr>
+                      <w:rFonts w:ascii="Arial" w:cs="Arial" w:eastAsia="Arial" w:hAnsi="Arial"/>
+                      <w:color w:val="1E293B"/>
+                      <w:sz w:val="21"/>
+                      <w:szCs w:val="21"/>
+                    </w:rPr>
+                    <w:t xml:space="preserve"> </w:t>
+                  </w:r>
+                </w:p>
+              </w:tc>
+            </w:tr>
+          </w:tbl>
+          <w:p>
+            <w:pPr>
+              <w:spacing w:after="60" w:before="0" w:line="276"/>
             </w:pPr>
             <w:r>
               <w:rPr>
@@ -634,7 +807,7 @@
                 <w:sz w:val="21"/>
                 <w:szCs w:val="21"/>
               </w:rPr>
-              <w:t xml:space="preserve"> </w:t>
+              <w:t xml:space="preserve"/>
             </w:r>
           </w:p>
           <w:p>
@@ -653,12 +826,59 @@
               <w:t xml:space="preserve">porque </w:t>
             </w:r>
           </w:p>
-          <w:p>
-            <w:pPr>
-              <w:pBdr>
-                <w:bottom w:val="dashed" w:color="9FB3C8" w:sz="6" w:space="1"/>
-              </w:pBdr>
-              <w:spacing w:after="0" w:before="0" w:line="420"/>
+          <w:tbl>
+            <w:tblPr>
+              <w:tblW w:type="dxa" w:w="9318"/>
+              <w:tblBorders>
+                <w:top w:val="single" w:color="auto" w:sz="4"/>
+                <w:left w:val="single" w:color="auto" w:sz="4"/>
+                <w:bottom w:val="single" w:color="auto" w:sz="4"/>
+                <w:right w:val="single" w:color="auto" w:sz="4"/>
+                <w:insideH w:val="single" w:color="auto" w:sz="4"/>
+                <w:insideV w:val="single" w:color="auto" w:sz="4"/>
+              </w:tblBorders>
+            </w:tblPr>
+            <w:tblGrid>
+              <w:gridCol w:w="9318"/>
+            </w:tblGrid>
+            <w:tr>
+              <w:tc>
+                <w:tcPr>
+                  <w:tcW w:type="dxa" w:w="9318"/>
+                  <w:tcBorders>
+                    <w:top w:val="single" w:color="93C5FD" w:sz="8"/>
+                    <w:left w:val="single" w:color="93C5FD" w:sz="8"/>
+                    <w:bottom w:val="single" w:color="93C5FD" w:sz="8"/>
+                    <w:right w:val="single" w:color="93C5FD" w:sz="8"/>
+                  </w:tcBorders>
+                  <w:shd w:fill="F8FBFF" w:color="auto" w:val="clear"/>
+                  <w:tcMar>
+                    <w:top w:type="dxa" w:w="80"/>
+                    <w:left w:type="dxa" w:w="140"/>
+                    <w:bottom w:type="dxa" w:w="80"/>
+                    <w:right w:type="dxa" w:w="140"/>
+                  </w:tcMar>
+                </w:tcPr>
+                <w:p>
+                  <w:pPr>
+                    <w:spacing w:after="0" w:before="0" w:line="420"/>
+                  </w:pPr>
+                  <w:r>
+                    <w:rPr>
+                      <w:rFonts w:ascii="Arial" w:cs="Arial" w:eastAsia="Arial" w:hAnsi="Arial"/>
+                      <w:color w:val="1E293B"/>
+                      <w:sz w:val="21"/>
+                      <w:szCs w:val="21"/>
+                    </w:rPr>
+                    <w:t xml:space="preserve"> </w:t>
+                  </w:r>
+                </w:p>
+              </w:tc>
+            </w:tr>
+          </w:tbl>
+          <w:p>
+            <w:pPr>
+              <w:spacing w:after="60" w:before="0" w:line="276"/>
             </w:pPr>
             <w:r>
               <w:rPr>
@@ -667,7 +887,7 @@
                 <w:sz w:val="21"/>
                 <w:szCs w:val="21"/>
               </w:rPr>
-              <w:t xml:space="preserve"> </w:t>
+              <w:t xml:space="preserve"/>
             </w:r>
           </w:p>
         </w:tc>
@@ -736,7 +956,7 @@
                 <w:sz w:val="20"/>
                 <w:szCs w:val="20"/>
               </w:rPr>
-              <w:t xml:space="preserve">PASO 4  </w:t>
+              <w:t xml:space="preserve">PASO 4 </w:t>
             </w:r>
             <w:r>
               <w:rPr>
@@ -747,7 +967,7 @@
                 <w:sz w:val="26"/>
                 <w:szCs w:val="26"/>
               </w:rPr>
-              <w:t xml:space="preserve">🎛️ Variables</w:t>
+              <w:t xml:space="preserve"> Variables</w:t>
             </w:r>
           </w:p>
           <w:p>
@@ -1162,7 +1382,7 @@
                 <w:sz w:val="20"/>
                 <w:szCs w:val="20"/>
               </w:rPr>
-              <w:t xml:space="preserve">PASO 5  </w:t>
+              <w:t xml:space="preserve">PASO 5 </w:t>
             </w:r>
             <w:r>
               <w:rPr>
@@ -1173,7 +1393,7 @@
                 <w:sz w:val="26"/>
                 <w:szCs w:val="26"/>
               </w:rPr>
-              <w:t xml:space="preserve">🧰 Materiales</w:t>
+              <w:t xml:space="preserve"> Materiales</w:t>
             </w:r>
           </w:p>
           <w:p>
@@ -1209,12 +1429,101 @@
               <w:right w:type="dxa" w:w="160"/>
             </w:tcMar>
           </w:tcPr>
-          <w:p>
-            <w:pPr>
-              <w:pBdr>
-                <w:bottom w:val="dashed" w:color="9FB3C8" w:sz="6" w:space="1"/>
-              </w:pBdr>
-              <w:spacing w:after="0" w:before="0" w:line="420"/>
+          <w:tbl>
+            <w:tblPr>
+              <w:tblW w:type="dxa" w:w="9318"/>
+              <w:tblBorders>
+                <w:top w:val="single" w:color="auto" w:sz="4"/>
+                <w:left w:val="single" w:color="auto" w:sz="4"/>
+                <w:bottom w:val="single" w:color="auto" w:sz="4"/>
+                <w:right w:val="single" w:color="auto" w:sz="4"/>
+                <w:insideH w:val="single" w:color="auto" w:sz="4"/>
+                <w:insideV w:val="single" w:color="auto" w:sz="4"/>
+              </w:tblBorders>
+            </w:tblPr>
+            <w:tblGrid>
+              <w:gridCol w:w="9318"/>
+            </w:tblGrid>
+            <w:tr>
+              <w:tc>
+                <w:tcPr>
+                  <w:tcW w:type="dxa" w:w="9318"/>
+                  <w:tcBorders>
+                    <w:top w:val="single" w:color="93C5FD" w:sz="8"/>
+                    <w:left w:val="single" w:color="93C5FD" w:sz="8"/>
+                    <w:bottom w:val="single" w:color="93C5FD" w:sz="8"/>
+                    <w:right w:val="single" w:color="93C5FD" w:sz="8"/>
+                  </w:tcBorders>
+                  <w:shd w:fill="F8FBFF" w:color="auto" w:val="clear"/>
+                  <w:tcMar>
+                    <w:top w:type="dxa" w:w="80"/>
+                    <w:left w:type="dxa" w:w="140"/>
+                    <w:bottom w:type="dxa" w:w="80"/>
+                    <w:right w:type="dxa" w:w="140"/>
+                  </w:tcMar>
+                </w:tcPr>
+                <w:p>
+                  <w:pPr>
+                    <w:spacing w:after="0" w:before="0" w:line="420"/>
+                  </w:pPr>
+                  <w:r>
+                    <w:rPr>
+                      <w:rFonts w:ascii="Arial" w:cs="Arial" w:eastAsia="Arial" w:hAnsi="Arial"/>
+                      <w:color w:val="1E293B"/>
+                      <w:sz w:val="21"/>
+                      <w:szCs w:val="21"/>
+                    </w:rPr>
+                    <w:t xml:space="preserve"> </w:t>
+                  </w:r>
+                </w:p>
+                <w:p>
+                  <w:pPr>
+                    <w:spacing w:after="0" w:before="0" w:line="420"/>
+                  </w:pPr>
+                  <w:r>
+                    <w:rPr>
+                      <w:rFonts w:ascii="Arial" w:cs="Arial" w:eastAsia="Arial" w:hAnsi="Arial"/>
+                      <w:color w:val="1E293B"/>
+                      <w:sz w:val="21"/>
+                      <w:szCs w:val="21"/>
+                    </w:rPr>
+                    <w:t xml:space="preserve"> </w:t>
+                  </w:r>
+                </w:p>
+                <w:p>
+                  <w:pPr>
+                    <w:spacing w:after="0" w:before="0" w:line="420"/>
+                  </w:pPr>
+                  <w:r>
+                    <w:rPr>
+                      <w:rFonts w:ascii="Arial" w:cs="Arial" w:eastAsia="Arial" w:hAnsi="Arial"/>
+                      <w:color w:val="1E293B"/>
+                      <w:sz w:val="21"/>
+                      <w:szCs w:val="21"/>
+                    </w:rPr>
+                    <w:t xml:space="preserve"> </w:t>
+                  </w:r>
+                </w:p>
+                <w:p>
+                  <w:pPr>
+                    <w:spacing w:after="0" w:before="0" w:line="420"/>
+                  </w:pPr>
+                  <w:r>
+                    <w:rPr>
+                      <w:rFonts w:ascii="Arial" w:cs="Arial" w:eastAsia="Arial" w:hAnsi="Arial"/>
+                      <w:color w:val="1E293B"/>
+                      <w:sz w:val="21"/>
+                      <w:szCs w:val="21"/>
+                    </w:rPr>
+                    <w:t xml:space="preserve"> </w:t>
+                  </w:r>
+                </w:p>
+              </w:tc>
+            </w:tr>
+          </w:tbl>
+          <w:p>
+            <w:pPr>
+              <w:spacing w:after="60" w:before="0" w:line="276"/>
             </w:pPr>
             <w:r>
               <w:rPr>
@@ -1223,58 +1532,7 @@
                 <w:sz w:val="21"/>
                 <w:szCs w:val="21"/>
               </w:rPr>
-              <w:t xml:space="preserve"> </w:t>
-            </w:r>
-          </w:p>
-          <w:p>
-            <w:pPr>
-              <w:pBdr>
-                <w:bottom w:val="dashed" w:color="9FB3C8" w:sz="6" w:space="1"/>
-              </w:pBdr>
-              <w:spacing w:after="0" w:before="0" w:line="420"/>
-            </w:pPr>
-            <w:r>
-              <w:rPr>
-                <w:rFonts w:ascii="Arial" w:cs="Arial" w:eastAsia="Arial" w:hAnsi="Arial"/>
-                <w:color w:val="1E293B"/>
-                <w:sz w:val="21"/>
-                <w:szCs w:val="21"/>
-              </w:rPr>
-              <w:t xml:space="preserve"> </w:t>
-            </w:r>
-          </w:p>
-          <w:p>
-            <w:pPr>
-              <w:pBdr>
-                <w:bottom w:val="dashed" w:color="9FB3C8" w:sz="6" w:space="1"/>
-              </w:pBdr>
-              <w:spacing w:after="0" w:before="0" w:line="420"/>
-            </w:pPr>
-            <w:r>
-              <w:rPr>
-                <w:rFonts w:ascii="Arial" w:cs="Arial" w:eastAsia="Arial" w:hAnsi="Arial"/>
-                <w:color w:val="1E293B"/>
-                <w:sz w:val="21"/>
-                <w:szCs w:val="21"/>
-              </w:rPr>
-              <w:t xml:space="preserve"> </w:t>
-            </w:r>
-          </w:p>
-          <w:p>
-            <w:pPr>
-              <w:pBdr>
-                <w:bottom w:val="dashed" w:color="9FB3C8" w:sz="6" w:space="1"/>
-              </w:pBdr>
-              <w:spacing w:after="0" w:before="0" w:line="420"/>
-            </w:pPr>
-            <w:r>
-              <w:rPr>
-                <w:rFonts w:ascii="Arial" w:cs="Arial" w:eastAsia="Arial" w:hAnsi="Arial"/>
-                <w:color w:val="1E293B"/>
-                <w:sz w:val="21"/>
-                <w:szCs w:val="21"/>
-              </w:rPr>
-              <w:t xml:space="preserve"> </w:t>
+              <w:t xml:space="preserve"/>
             </w:r>
           </w:p>
         </w:tc>
@@ -1343,7 +1601,7 @@
                 <w:sz w:val="20"/>
                 <w:szCs w:val="20"/>
               </w:rPr>
-              <w:t xml:space="preserve">PASO 6  </w:t>
+              <w:t xml:space="preserve">PASO 6 </w:t>
             </w:r>
             <w:r>
               <w:rPr>
@@ -1354,7 +1612,7 @@
                 <w:sz w:val="26"/>
                 <w:szCs w:val="26"/>
               </w:rPr>
-              <w:t xml:space="preserve">📋 Procedimiento</w:t>
+              <w:t xml:space="preserve"> Procedimiento</w:t>
             </w:r>
           </w:p>
           <w:p>
@@ -1406,12 +1664,59 @@
               <w:t xml:space="preserve">1.</w:t>
             </w:r>
           </w:p>
-          <w:p>
-            <w:pPr>
-              <w:pBdr>
-                <w:bottom w:val="dashed" w:color="9FB3C8" w:sz="6" w:space="1"/>
-              </w:pBdr>
-              <w:spacing w:after="0" w:before="0" w:line="420"/>
+          <w:tbl>
+            <w:tblPr>
+              <w:tblW w:type="dxa" w:w="9318"/>
+              <w:tblBorders>
+                <w:top w:val="single" w:color="auto" w:sz="4"/>
+                <w:left w:val="single" w:color="auto" w:sz="4"/>
+                <w:bottom w:val="single" w:color="auto" w:sz="4"/>
+                <w:right w:val="single" w:color="auto" w:sz="4"/>
+                <w:insideH w:val="single" w:color="auto" w:sz="4"/>
+                <w:insideV w:val="single" w:color="auto" w:sz="4"/>
+              </w:tblBorders>
+            </w:tblPr>
+            <w:tblGrid>
+              <w:gridCol w:w="9318"/>
+            </w:tblGrid>
+            <w:tr>
+              <w:tc>
+                <w:tcPr>
+                  <w:tcW w:type="dxa" w:w="9318"/>
+                  <w:tcBorders>
+                    <w:top w:val="single" w:color="93C5FD" w:sz="8"/>
+                    <w:left w:val="single" w:color="93C5FD" w:sz="8"/>
+                    <w:bottom w:val="single" w:color="93C5FD" w:sz="8"/>
+                    <w:right w:val="single" w:color="93C5FD" w:sz="8"/>
+                  </w:tcBorders>
+                  <w:shd w:fill="F8FBFF" w:color="auto" w:val="clear"/>
+                  <w:tcMar>
+                    <w:top w:type="dxa" w:w="80"/>
+                    <w:left w:type="dxa" w:w="140"/>
+                    <w:bottom w:type="dxa" w:w="80"/>
+                    <w:right w:type="dxa" w:w="140"/>
+                  </w:tcMar>
+                </w:tcPr>
+                <w:p>
+                  <w:pPr>
+                    <w:spacing w:after="0" w:before="0" w:line="420"/>
+                  </w:pPr>
+                  <w:r>
+                    <w:rPr>
+                      <w:rFonts w:ascii="Arial" w:cs="Arial" w:eastAsia="Arial" w:hAnsi="Arial"/>
+                      <w:color w:val="1E293B"/>
+                      <w:sz w:val="21"/>
+                      <w:szCs w:val="21"/>
+                    </w:rPr>
+                    <w:t xml:space="preserve"> </w:t>
+                  </w:r>
+                </w:p>
+              </w:tc>
+            </w:tr>
+          </w:tbl>
+          <w:p>
+            <w:pPr>
+              <w:spacing w:after="60" w:before="0" w:line="276"/>
             </w:pPr>
             <w:r>
               <w:rPr>
@@ -1420,7 +1725,7 @@
                 <w:sz w:val="21"/>
                 <w:szCs w:val="21"/>
               </w:rPr>
-              <w:t xml:space="preserve"> </w:t>
+              <w:t xml:space="preserve"/>
             </w:r>
           </w:p>
           <w:p>
@@ -1439,12 +1744,59 @@
               <w:t xml:space="preserve">2.</w:t>
             </w:r>
           </w:p>
-          <w:p>
-            <w:pPr>
-              <w:pBdr>
-                <w:bottom w:val="dashed" w:color="9FB3C8" w:sz="6" w:space="1"/>
-              </w:pBdr>
-              <w:spacing w:after="0" w:before="0" w:line="420"/>
+          <w:tbl>
+            <w:tblPr>
+              <w:tblW w:type="dxa" w:w="9318"/>
+              <w:tblBorders>
+                <w:top w:val="single" w:color="auto" w:sz="4"/>
+                <w:left w:val="single" w:color="auto" w:sz="4"/>
+                <w:bottom w:val="single" w:color="auto" w:sz="4"/>
+                <w:right w:val="single" w:color="auto" w:sz="4"/>
+                <w:insideH w:val="single" w:color="auto" w:sz="4"/>
+                <w:insideV w:val="single" w:color="auto" w:sz="4"/>
+              </w:tblBorders>
+            </w:tblPr>
+            <w:tblGrid>
+              <w:gridCol w:w="9318"/>
+            </w:tblGrid>
+            <w:tr>
+              <w:tc>
+                <w:tcPr>
+                  <w:tcW w:type="dxa" w:w="9318"/>
+                  <w:tcBorders>
+                    <w:top w:val="single" w:color="93C5FD" w:sz="8"/>
+                    <w:left w:val="single" w:color="93C5FD" w:sz="8"/>
+                    <w:bottom w:val="single" w:color="93C5FD" w:sz="8"/>
+                    <w:right w:val="single" w:color="93C5FD" w:sz="8"/>
+                  </w:tcBorders>
+                  <w:shd w:fill="F8FBFF" w:color="auto" w:val="clear"/>
+                  <w:tcMar>
+                    <w:top w:type="dxa" w:w="80"/>
+                    <w:left w:type="dxa" w:w="140"/>
+                    <w:bottom w:type="dxa" w:w="80"/>
+                    <w:right w:type="dxa" w:w="140"/>
+                  </w:tcMar>
+                </w:tcPr>
+                <w:p>
+                  <w:pPr>
+                    <w:spacing w:after="0" w:before="0" w:line="420"/>
+                  </w:pPr>
+                  <w:r>
+                    <w:rPr>
+                      <w:rFonts w:ascii="Arial" w:cs="Arial" w:eastAsia="Arial" w:hAnsi="Arial"/>
+                      <w:color w:val="1E293B"/>
+                      <w:sz w:val="21"/>
+                      <w:szCs w:val="21"/>
+                    </w:rPr>
+                    <w:t xml:space="preserve"> </w:t>
+                  </w:r>
+                </w:p>
+              </w:tc>
+            </w:tr>
+          </w:tbl>
+          <w:p>
+            <w:pPr>
+              <w:spacing w:after="60" w:before="0" w:line="276"/>
             </w:pPr>
             <w:r>
               <w:rPr>
@@ -1453,7 +1805,7 @@
                 <w:sz w:val="21"/>
                 <w:szCs w:val="21"/>
               </w:rPr>
-              <w:t xml:space="preserve"> </w:t>
+              <w:t xml:space="preserve"/>
             </w:r>
           </w:p>
           <w:p>
@@ -1472,12 +1824,59 @@
               <w:t xml:space="preserve">3.</w:t>
             </w:r>
           </w:p>
-          <w:p>
-            <w:pPr>
-              <w:pBdr>
-                <w:bottom w:val="dashed" w:color="9FB3C8" w:sz="6" w:space="1"/>
-              </w:pBdr>
-              <w:spacing w:after="0" w:before="0" w:line="420"/>
+          <w:tbl>
+            <w:tblPr>
+              <w:tblW w:type="dxa" w:w="9318"/>
+              <w:tblBorders>
+                <w:top w:val="single" w:color="auto" w:sz="4"/>
+                <w:left w:val="single" w:color="auto" w:sz="4"/>
+                <w:bottom w:val="single" w:color="auto" w:sz="4"/>
+                <w:right w:val="single" w:color="auto" w:sz="4"/>
+                <w:insideH w:val="single" w:color="auto" w:sz="4"/>
+                <w:insideV w:val="single" w:color="auto" w:sz="4"/>
+              </w:tblBorders>
+            </w:tblPr>
+            <w:tblGrid>
+              <w:gridCol w:w="9318"/>
+            </w:tblGrid>
+            <w:tr>
+              <w:tc>
+                <w:tcPr>
+                  <w:tcW w:type="dxa" w:w="9318"/>
+                  <w:tcBorders>
+                    <w:top w:val="single" w:color="93C5FD" w:sz="8"/>
+                    <w:left w:val="single" w:color="93C5FD" w:sz="8"/>
+                    <w:bottom w:val="single" w:color="93C5FD" w:sz="8"/>
+                    <w:right w:val="single" w:color="93C5FD" w:sz="8"/>
+                  </w:tcBorders>
+                  <w:shd w:fill="F8FBFF" w:color="auto" w:val="clear"/>
+                  <w:tcMar>
+                    <w:top w:type="dxa" w:w="80"/>
+                    <w:left w:type="dxa" w:w="140"/>
+                    <w:bottom w:type="dxa" w:w="80"/>
+                    <w:right w:type="dxa" w:w="140"/>
+                  </w:tcMar>
+                </w:tcPr>
+                <w:p>
+                  <w:pPr>
+                    <w:spacing w:after="0" w:before="0" w:line="420"/>
+                  </w:pPr>
+                  <w:r>
+                    <w:rPr>
+                      <w:rFonts w:ascii="Arial" w:cs="Arial" w:eastAsia="Arial" w:hAnsi="Arial"/>
+                      <w:color w:val="1E293B"/>
+                      <w:sz w:val="21"/>
+                      <w:szCs w:val="21"/>
+                    </w:rPr>
+                    <w:t xml:space="preserve"> </w:t>
+                  </w:r>
+                </w:p>
+              </w:tc>
+            </w:tr>
+          </w:tbl>
+          <w:p>
+            <w:pPr>
+              <w:spacing w:after="60" w:before="0" w:line="276"/>
             </w:pPr>
             <w:r>
               <w:rPr>
@@ -1486,7 +1885,7 @@
                 <w:sz w:val="21"/>
                 <w:szCs w:val="21"/>
               </w:rPr>
-              <w:t xml:space="preserve"> </w:t>
+              <w:t xml:space="preserve"/>
             </w:r>
           </w:p>
           <w:p>
@@ -1505,12 +1904,59 @@
               <w:t xml:space="preserve">4.</w:t>
             </w:r>
           </w:p>
-          <w:p>
-            <w:pPr>
-              <w:pBdr>
-                <w:bottom w:val="dashed" w:color="9FB3C8" w:sz="6" w:space="1"/>
-              </w:pBdr>
-              <w:spacing w:after="0" w:before="0" w:line="420"/>
+          <w:tbl>
+            <w:tblPr>
+              <w:tblW w:type="dxa" w:w="9318"/>
+              <w:tblBorders>
+                <w:top w:val="single" w:color="auto" w:sz="4"/>
+                <w:left w:val="single" w:color="auto" w:sz="4"/>
+                <w:bottom w:val="single" w:color="auto" w:sz="4"/>
+                <w:right w:val="single" w:color="auto" w:sz="4"/>
+                <w:insideH w:val="single" w:color="auto" w:sz="4"/>
+                <w:insideV w:val="single" w:color="auto" w:sz="4"/>
+              </w:tblBorders>
+            </w:tblPr>
+            <w:tblGrid>
+              <w:gridCol w:w="9318"/>
+            </w:tblGrid>
+            <w:tr>
+              <w:tc>
+                <w:tcPr>
+                  <w:tcW w:type="dxa" w:w="9318"/>
+                  <w:tcBorders>
+                    <w:top w:val="single" w:color="93C5FD" w:sz="8"/>
+                    <w:left w:val="single" w:color="93C5FD" w:sz="8"/>
+                    <w:bottom w:val="single" w:color="93C5FD" w:sz="8"/>
+                    <w:right w:val="single" w:color="93C5FD" w:sz="8"/>
+                  </w:tcBorders>
+                  <w:shd w:fill="F8FBFF" w:color="auto" w:val="clear"/>
+                  <w:tcMar>
+                    <w:top w:type="dxa" w:w="80"/>
+                    <w:left w:type="dxa" w:w="140"/>
+                    <w:bottom w:type="dxa" w:w="80"/>
+                    <w:right w:type="dxa" w:w="140"/>
+                  </w:tcMar>
+                </w:tcPr>
+                <w:p>
+                  <w:pPr>
+                    <w:spacing w:after="0" w:before="0" w:line="420"/>
+                  </w:pPr>
+                  <w:r>
+                    <w:rPr>
+                      <w:rFonts w:ascii="Arial" w:cs="Arial" w:eastAsia="Arial" w:hAnsi="Arial"/>
+                      <w:color w:val="1E293B"/>
+                      <w:sz w:val="21"/>
+                      <w:szCs w:val="21"/>
+                    </w:rPr>
+                    <w:t xml:space="preserve"> </w:t>
+                  </w:r>
+                </w:p>
+              </w:tc>
+            </w:tr>
+          </w:tbl>
+          <w:p>
+            <w:pPr>
+              <w:spacing w:after="60" w:before="0" w:line="276"/>
             </w:pPr>
             <w:r>
               <w:rPr>
@@ -1519,7 +1965,7 @@
                 <w:sz w:val="21"/>
                 <w:szCs w:val="21"/>
               </w:rPr>
-              <w:t xml:space="preserve"> </w:t>
+              <w:t xml:space="preserve"/>
             </w:r>
           </w:p>
           <w:p>
@@ -1538,12 +1984,59 @@
               <w:t xml:space="preserve">5.</w:t>
             </w:r>
           </w:p>
-          <w:p>
-            <w:pPr>
-              <w:pBdr>
-                <w:bottom w:val="dashed" w:color="9FB3C8" w:sz="6" w:space="1"/>
-              </w:pBdr>
-              <w:spacing w:after="0" w:before="0" w:line="420"/>
+          <w:tbl>
+            <w:tblPr>
+              <w:tblW w:type="dxa" w:w="9318"/>
+              <w:tblBorders>
+                <w:top w:val="single" w:color="auto" w:sz="4"/>
+                <w:left w:val="single" w:color="auto" w:sz="4"/>
+                <w:bottom w:val="single" w:color="auto" w:sz="4"/>
+                <w:right w:val="single" w:color="auto" w:sz="4"/>
+                <w:insideH w:val="single" w:color="auto" w:sz="4"/>
+                <w:insideV w:val="single" w:color="auto" w:sz="4"/>
+              </w:tblBorders>
+            </w:tblPr>
+            <w:tblGrid>
+              <w:gridCol w:w="9318"/>
+            </w:tblGrid>
+            <w:tr>
+              <w:tc>
+                <w:tcPr>
+                  <w:tcW w:type="dxa" w:w="9318"/>
+                  <w:tcBorders>
+                    <w:top w:val="single" w:color="93C5FD" w:sz="8"/>
+                    <w:left w:val="single" w:color="93C5FD" w:sz="8"/>
+                    <w:bottom w:val="single" w:color="93C5FD" w:sz="8"/>
+                    <w:right w:val="single" w:color="93C5FD" w:sz="8"/>
+                  </w:tcBorders>
+                  <w:shd w:fill="F8FBFF" w:color="auto" w:val="clear"/>
+                  <w:tcMar>
+                    <w:top w:type="dxa" w:w="80"/>
+                    <w:left w:type="dxa" w:w="140"/>
+                    <w:bottom w:type="dxa" w:w="80"/>
+                    <w:right w:type="dxa" w:w="140"/>
+                  </w:tcMar>
+                </w:tcPr>
+                <w:p>
+                  <w:pPr>
+                    <w:spacing w:after="0" w:before="0" w:line="420"/>
+                  </w:pPr>
+                  <w:r>
+                    <w:rPr>
+                      <w:rFonts w:ascii="Arial" w:cs="Arial" w:eastAsia="Arial" w:hAnsi="Arial"/>
+                      <w:color w:val="1E293B"/>
+                      <w:sz w:val="21"/>
+                      <w:szCs w:val="21"/>
+                    </w:rPr>
+                    <w:t xml:space="preserve"> </w:t>
+                  </w:r>
+                </w:p>
+              </w:tc>
+            </w:tr>
+          </w:tbl>
+          <w:p>
+            <w:pPr>
+              <w:spacing w:after="60" w:before="0" w:line="276"/>
             </w:pPr>
             <w:r>
               <w:rPr>
@@ -1552,7 +2045,7 @@
                 <w:sz w:val="21"/>
                 <w:szCs w:val="21"/>
               </w:rPr>
-              <w:t xml:space="preserve"> </w:t>
+              <w:t xml:space="preserve"/>
             </w:r>
           </w:p>
         </w:tc>
@@ -1621,7 +2114,7 @@
                 <w:sz w:val="20"/>
                 <w:szCs w:val="20"/>
               </w:rPr>
-              <w:t xml:space="preserve">PASO 7  </w:t>
+              <w:t xml:space="preserve">PASO 7 </w:t>
             </w:r>
             <w:r>
               <w:rPr>
@@ -1632,7 +2125,7 @@
                 <w:sz w:val="26"/>
                 <w:szCs w:val="26"/>
               </w:rPr>
-              <w:t xml:space="preserve">🦺 Medidas de seguridad</w:t>
+              <w:t xml:space="preserve"> Medidas de seguridad</w:t>
             </w:r>
           </w:p>
           <w:p>
@@ -1668,12 +2161,73 @@
               <w:right w:type="dxa" w:w="160"/>
             </w:tcMar>
           </w:tcPr>
-          <w:p>
-            <w:pPr>
-              <w:pBdr>
-                <w:bottom w:val="dashed" w:color="9FB3C8" w:sz="6" w:space="1"/>
-              </w:pBdr>
-              <w:spacing w:after="0" w:before="0" w:line="420"/>
+          <w:tbl>
+            <w:tblPr>
+              <w:tblW w:type="dxa" w:w="9318"/>
+              <w:tblBorders>
+                <w:top w:val="single" w:color="auto" w:sz="4"/>
+                <w:left w:val="single" w:color="auto" w:sz="4"/>
+                <w:bottom w:val="single" w:color="auto" w:sz="4"/>
+                <w:right w:val="single" w:color="auto" w:sz="4"/>
+                <w:insideH w:val="single" w:color="auto" w:sz="4"/>
+                <w:insideV w:val="single" w:color="auto" w:sz="4"/>
+              </w:tblBorders>
+            </w:tblPr>
+            <w:tblGrid>
+              <w:gridCol w:w="9318"/>
+            </w:tblGrid>
+            <w:tr>
+              <w:tc>
+                <w:tcPr>
+                  <w:tcW w:type="dxa" w:w="9318"/>
+                  <w:tcBorders>
+                    <w:top w:val="single" w:color="93C5FD" w:sz="8"/>
+                    <w:left w:val="single" w:color="93C5FD" w:sz="8"/>
+                    <w:bottom w:val="single" w:color="93C5FD" w:sz="8"/>
+                    <w:right w:val="single" w:color="93C5FD" w:sz="8"/>
+                  </w:tcBorders>
+                  <w:shd w:fill="F8FBFF" w:color="auto" w:val="clear"/>
+                  <w:tcMar>
+                    <w:top w:type="dxa" w:w="80"/>
+                    <w:left w:type="dxa" w:w="140"/>
+                    <w:bottom w:type="dxa" w:w="80"/>
+                    <w:right w:type="dxa" w:w="140"/>
+                  </w:tcMar>
+                </w:tcPr>
+                <w:p>
+                  <w:pPr>
+                    <w:spacing w:after="0" w:before="0" w:line="420"/>
+                  </w:pPr>
+                  <w:r>
+                    <w:rPr>
+                      <w:rFonts w:ascii="Arial" w:cs="Arial" w:eastAsia="Arial" w:hAnsi="Arial"/>
+                      <w:color w:val="1E293B"/>
+                      <w:sz w:val="21"/>
+                      <w:szCs w:val="21"/>
+                    </w:rPr>
+                    <w:t xml:space="preserve"> </w:t>
+                  </w:r>
+                </w:p>
+                <w:p>
+                  <w:pPr>
+                    <w:spacing w:after="0" w:before="0" w:line="420"/>
+                  </w:pPr>
+                  <w:r>
+                    <w:rPr>
+                      <w:rFonts w:ascii="Arial" w:cs="Arial" w:eastAsia="Arial" w:hAnsi="Arial"/>
+                      <w:color w:val="1E293B"/>
+                      <w:sz w:val="21"/>
+                      <w:szCs w:val="21"/>
+                    </w:rPr>
+                    <w:t xml:space="preserve"> </w:t>
+                  </w:r>
+                </w:p>
+              </w:tc>
+            </w:tr>
+          </w:tbl>
+          <w:p>
+            <w:pPr>
+              <w:spacing w:after="60" w:before="0" w:line="276"/>
             </w:pPr>
             <w:r>
               <w:rPr>
@@ -1682,24 +2236,7 @@
                 <w:sz w:val="21"/>
                 <w:szCs w:val="21"/>
               </w:rPr>
-              <w:t xml:space="preserve"> </w:t>
-            </w:r>
-          </w:p>
-          <w:p>
-            <w:pPr>
-              <w:pBdr>
-                <w:bottom w:val="dashed" w:color="9FB3C8" w:sz="6" w:space="1"/>
-              </w:pBdr>
-              <w:spacing w:after="0" w:before="0" w:line="420"/>
-            </w:pPr>
-            <w:r>
-              <w:rPr>
-                <w:rFonts w:ascii="Arial" w:cs="Arial" w:eastAsia="Arial" w:hAnsi="Arial"/>
-                <w:color w:val="1E293B"/>
-                <w:sz w:val="21"/>
-                <w:szCs w:val="21"/>
-              </w:rPr>
-              <w:t xml:space="preserve"> </w:t>
+              <w:t xml:space="preserve"/>
             </w:r>
           </w:p>
         </w:tc>
@@ -1768,7 +2305,7 @@
                 <w:sz w:val="20"/>
                 <w:szCs w:val="20"/>
               </w:rPr>
-              <w:t xml:space="preserve">PASO 8  </w:t>
+              <w:t xml:space="preserve">PASO 8 </w:t>
             </w:r>
             <w:r>
               <w:rPr>
@@ -1779,7 +2316,7 @@
                 <w:sz w:val="26"/>
                 <w:szCs w:val="26"/>
               </w:rPr>
-              <w:t xml:space="preserve">📊 Cómo registraré mis datos</w:t>
+              <w:t xml:space="preserve"> Cómo registraré mis datos</w:t>
             </w:r>
           </w:p>
           <w:p>
@@ -2417,7 +2954,7 @@
                 <w:sz w:val="20"/>
                 <w:szCs w:val="20"/>
               </w:rPr>
-              <w:t xml:space="preserve">PASO 9  </w:t>
+              <w:t xml:space="preserve">PASO 9 </w:t>
             </w:r>
             <w:r>
               <w:rPr>
@@ -2428,7 +2965,7 @@
                 <w:sz w:val="26"/>
                 <w:szCs w:val="26"/>
               </w:rPr>
-              <w:t xml:space="preserve">📚 Mis fuentes (Referencias APA)</w:t>
+              <w:t xml:space="preserve"> Mis fuentes (Referencias APA)</w:t>
             </w:r>
           </w:p>
           <w:p>
@@ -2466,32 +3003,32 @@
           </w:tcPr>
           <w:p>
             <w:pPr>
-              <w:spacing w:after="80" w:before="40" w:line="276"/>
+              <w:spacing w:after="60" w:before="40" w:line="276"/>
             </w:pPr>
             <w:r>
               <w:rPr>
                 <w:rFonts w:ascii="Arial" w:cs="Arial" w:eastAsia="Arial" w:hAnsi="Arial"/>
                 <w:i/>
                 <w:iCs/>
-                <w:color w:val="64748B"/>
-                <w:sz w:val="17"/>
-                <w:szCs w:val="17"/>
+                <w:color w:val="8A6100"/>
+                <w:sz w:val="18"/>
+                <w:szCs w:val="18"/>
               </w:rPr>
               <w:t xml:space="preserve">Orden: Autor o institución. (Año). Título. Página web o libro.</w:t>
             </w:r>
           </w:p>
           <w:p>
             <w:pPr>
-              <w:spacing w:after="80" w:before="40" w:line="276"/>
+              <w:spacing w:after="60" w:before="40" w:line="276"/>
             </w:pPr>
             <w:r>
               <w:rPr>
                 <w:rFonts w:ascii="Arial" w:cs="Arial" w:eastAsia="Arial" w:hAnsi="Arial"/>
                 <w:i/>
                 <w:iCs/>
-                <w:color w:val="64748B"/>
-                <w:sz w:val="17"/>
-                <w:szCs w:val="17"/>
+                <w:color w:val="8A6100"/>
+                <w:sz w:val="18"/>
+                <w:szCs w:val="18"/>
               </w:rPr>
               <w:t xml:space="preserve">Ejemplo: Ministerio de Salud. (2025). Dengue: síntomas y prevención. gob.pe</w:t>
             </w:r>
@@ -2512,12 +3049,59 @@
               <w:t xml:space="preserve">Fuente 1</w:t>
             </w:r>
           </w:p>
-          <w:p>
-            <w:pPr>
-              <w:pBdr>
-                <w:bottom w:val="dashed" w:color="9FB3C8" w:sz="6" w:space="1"/>
-              </w:pBdr>
-              <w:spacing w:after="0" w:before="0" w:line="420"/>
+          <w:tbl>
+            <w:tblPr>
+              <w:tblW w:type="dxa" w:w="9318"/>
+              <w:tblBorders>
+                <w:top w:val="single" w:color="auto" w:sz="4"/>
+                <w:left w:val="single" w:color="auto" w:sz="4"/>
+                <w:bottom w:val="single" w:color="auto" w:sz="4"/>
+                <w:right w:val="single" w:color="auto" w:sz="4"/>
+                <w:insideH w:val="single" w:color="auto" w:sz="4"/>
+                <w:insideV w:val="single" w:color="auto" w:sz="4"/>
+              </w:tblBorders>
+            </w:tblPr>
+            <w:tblGrid>
+              <w:gridCol w:w="9318"/>
+            </w:tblGrid>
+            <w:tr>
+              <w:tc>
+                <w:tcPr>
+                  <w:tcW w:type="dxa" w:w="9318"/>
+                  <w:tcBorders>
+                    <w:top w:val="single" w:color="93C5FD" w:sz="8"/>
+                    <w:left w:val="single" w:color="93C5FD" w:sz="8"/>
+                    <w:bottom w:val="single" w:color="93C5FD" w:sz="8"/>
+                    <w:right w:val="single" w:color="93C5FD" w:sz="8"/>
+                  </w:tcBorders>
+                  <w:shd w:fill="F8FBFF" w:color="auto" w:val="clear"/>
+                  <w:tcMar>
+                    <w:top w:type="dxa" w:w="80"/>
+                    <w:left w:type="dxa" w:w="140"/>
+                    <w:bottom w:type="dxa" w:w="80"/>
+                    <w:right w:type="dxa" w:w="140"/>
+                  </w:tcMar>
+                </w:tcPr>
+                <w:p>
+                  <w:pPr>
+                    <w:spacing w:after="0" w:before="0" w:line="420"/>
+                  </w:pPr>
+                  <w:r>
+                    <w:rPr>
+                      <w:rFonts w:ascii="Arial" w:cs="Arial" w:eastAsia="Arial" w:hAnsi="Arial"/>
+                      <w:color w:val="1E293B"/>
+                      <w:sz w:val="21"/>
+                      <w:szCs w:val="21"/>
+                    </w:rPr>
+                    <w:t xml:space="preserve"> </w:t>
+                  </w:r>
+                </w:p>
+              </w:tc>
+            </w:tr>
+          </w:tbl>
+          <w:p>
+            <w:pPr>
+              <w:spacing w:after="60" w:before="0" w:line="276"/>
             </w:pPr>
             <w:r>
               <w:rPr>
@@ -2526,7 +3110,7 @@
                 <w:sz w:val="21"/>
                 <w:szCs w:val="21"/>
               </w:rPr>
-              <w:t xml:space="preserve"> </w:t>
+              <w:t xml:space="preserve"/>
             </w:r>
           </w:p>
           <w:p>
@@ -2545,12 +3129,59 @@
               <w:t xml:space="preserve">Fuente 2</w:t>
             </w:r>
           </w:p>
-          <w:p>
-            <w:pPr>
-              <w:pBdr>
-                <w:bottom w:val="dashed" w:color="9FB3C8" w:sz="6" w:space="1"/>
-              </w:pBdr>
-              <w:spacing w:after="0" w:before="0" w:line="420"/>
+          <w:tbl>
+            <w:tblPr>
+              <w:tblW w:type="dxa" w:w="9318"/>
+              <w:tblBorders>
+                <w:top w:val="single" w:color="auto" w:sz="4"/>
+                <w:left w:val="single" w:color="auto" w:sz="4"/>
+                <w:bottom w:val="single" w:color="auto" w:sz="4"/>
+                <w:right w:val="single" w:color="auto" w:sz="4"/>
+                <w:insideH w:val="single" w:color="auto" w:sz="4"/>
+                <w:insideV w:val="single" w:color="auto" w:sz="4"/>
+              </w:tblBorders>
+            </w:tblPr>
+            <w:tblGrid>
+              <w:gridCol w:w="9318"/>
+            </w:tblGrid>
+            <w:tr>
+              <w:tc>
+                <w:tcPr>
+                  <w:tcW w:type="dxa" w:w="9318"/>
+                  <w:tcBorders>
+                    <w:top w:val="single" w:color="93C5FD" w:sz="8"/>
+                    <w:left w:val="single" w:color="93C5FD" w:sz="8"/>
+                    <w:bottom w:val="single" w:color="93C5FD" w:sz="8"/>
+                    <w:right w:val="single" w:color="93C5FD" w:sz="8"/>
+                  </w:tcBorders>
+                  <w:shd w:fill="F8FBFF" w:color="auto" w:val="clear"/>
+                  <w:tcMar>
+                    <w:top w:type="dxa" w:w="80"/>
+                    <w:left w:type="dxa" w:w="140"/>
+                    <w:bottom w:type="dxa" w:w="80"/>
+                    <w:right w:type="dxa" w:w="140"/>
+                  </w:tcMar>
+                </w:tcPr>
+                <w:p>
+                  <w:pPr>
+                    <w:spacing w:after="0" w:before="0" w:line="420"/>
+                  </w:pPr>
+                  <w:r>
+                    <w:rPr>
+                      <w:rFonts w:ascii="Arial" w:cs="Arial" w:eastAsia="Arial" w:hAnsi="Arial"/>
+                      <w:color w:val="1E293B"/>
+                      <w:sz w:val="21"/>
+                      <w:szCs w:val="21"/>
+                    </w:rPr>
+                    <w:t xml:space="preserve"> </w:t>
+                  </w:r>
+                </w:p>
+              </w:tc>
+            </w:tr>
+          </w:tbl>
+          <w:p>
+            <w:pPr>
+              <w:spacing w:after="60" w:before="0" w:line="276"/>
             </w:pPr>
             <w:r>
               <w:rPr>
@@ -2559,7 +3190,7 @@
                 <w:sz w:val="21"/>
                 <w:szCs w:val="21"/>
               </w:rPr>
-              <w:t xml:space="preserve"> </w:t>
+              <w:t xml:space="preserve"/>
             </w:r>
           </w:p>
           <w:p>
@@ -2578,12 +3209,59 @@
               <w:t xml:space="preserve">Fuente 3</w:t>
             </w:r>
           </w:p>
-          <w:p>
-            <w:pPr>
-              <w:pBdr>
-                <w:bottom w:val="dashed" w:color="9FB3C8" w:sz="6" w:space="1"/>
-              </w:pBdr>
-              <w:spacing w:after="0" w:before="0" w:line="420"/>
+          <w:tbl>
+            <w:tblPr>
+              <w:tblW w:type="dxa" w:w="9318"/>
+              <w:tblBorders>
+                <w:top w:val="single" w:color="auto" w:sz="4"/>
+                <w:left w:val="single" w:color="auto" w:sz="4"/>
+                <w:bottom w:val="single" w:color="auto" w:sz="4"/>
+                <w:right w:val="single" w:color="auto" w:sz="4"/>
+                <w:insideH w:val="single" w:color="auto" w:sz="4"/>
+                <w:insideV w:val="single" w:color="auto" w:sz="4"/>
+              </w:tblBorders>
+            </w:tblPr>
+            <w:tblGrid>
+              <w:gridCol w:w="9318"/>
+            </w:tblGrid>
+            <w:tr>
+              <w:tc>
+                <w:tcPr>
+                  <w:tcW w:type="dxa" w:w="9318"/>
+                  <w:tcBorders>
+                    <w:top w:val="single" w:color="93C5FD" w:sz="8"/>
+                    <w:left w:val="single" w:color="93C5FD" w:sz="8"/>
+                    <w:bottom w:val="single" w:color="93C5FD" w:sz="8"/>
+                    <w:right w:val="single" w:color="93C5FD" w:sz="8"/>
+                  </w:tcBorders>
+                  <w:shd w:fill="F8FBFF" w:color="auto" w:val="clear"/>
+                  <w:tcMar>
+                    <w:top w:type="dxa" w:w="80"/>
+                    <w:left w:type="dxa" w:w="140"/>
+                    <w:bottom w:type="dxa" w:w="80"/>
+                    <w:right w:type="dxa" w:w="140"/>
+                  </w:tcMar>
+                </w:tcPr>
+                <w:p>
+                  <w:pPr>
+                    <w:spacing w:after="0" w:before="0" w:line="420"/>
+                  </w:pPr>
+                  <w:r>
+                    <w:rPr>
+                      <w:rFonts w:ascii="Arial" w:cs="Arial" w:eastAsia="Arial" w:hAnsi="Arial"/>
+                      <w:color w:val="1E293B"/>
+                      <w:sz w:val="21"/>
+                      <w:szCs w:val="21"/>
+                    </w:rPr>
+                    <w:t xml:space="preserve"> </w:t>
+                  </w:r>
+                </w:p>
+              </w:tc>
+            </w:tr>
+          </w:tbl>
+          <w:p>
+            <w:pPr>
+              <w:spacing w:after="60" w:before="0" w:line="276"/>
             </w:pPr>
             <w:r>
               <w:rPr>
@@ -2592,7 +3270,201 @@
                 <w:sz w:val="21"/>
                 <w:szCs w:val="21"/>
               </w:rPr>
-              <w:t xml:space="preserve"> </w:t>
+              <w:t xml:space="preserve"/>
+            </w:r>
+          </w:p>
+        </w:tc>
+      </w:tr>
+    </w:tbl>
+    <w:p>
+      <w:pPr>
+        <w:spacing w:after="120" w:before="0" w:line="276"/>
+      </w:pPr>
+      <w:r>
+        <w:rPr>
+          <w:rFonts w:ascii="Arial" w:cs="Arial" w:eastAsia="Arial" w:hAnsi="Arial"/>
+          <w:color w:val="1E293B"/>
+          <w:sz w:val="21"/>
+          <w:szCs w:val="21"/>
+        </w:rPr>
+        <w:t xml:space="preserve"/>
+      </w:r>
+    </w:p>
+    <w:tbl>
+      <w:tblPr>
+        <w:tblW w:type="dxa" w:w="9638"/>
+        <w:tblBorders>
+          <w:top w:val="single" w:color="auto" w:sz="4"/>
+          <w:left w:val="single" w:color="auto" w:sz="4"/>
+          <w:bottom w:val="single" w:color="auto" w:sz="4"/>
+          <w:right w:val="single" w:color="auto" w:sz="4"/>
+          <w:insideH w:val="single" w:color="auto" w:sz="4"/>
+          <w:insideV w:val="single" w:color="auto" w:sz="4"/>
+        </w:tblBorders>
+      </w:tblPr>
+      <w:tblGrid>
+        <w:gridCol w:w="9638"/>
+      </w:tblGrid>
+      <w:tr>
+        <w:trPr>
+          <w:cantSplit/>
+        </w:trPr>
+        <w:tc>
+          <w:tcPr>
+            <w:tcW w:type="dxa" w:w="9638"/>
+            <w:tcBorders>
+              <w:top w:val="single" w:color="2563EB" w:sz="10"/>
+              <w:left w:val="single" w:color="2563EB" w:sz="10"/>
+              <w:bottom w:val="none" w:color="FFFFFF" w:sz="0"/>
+              <w:right w:val="single" w:color="2563EB" w:sz="10"/>
+            </w:tcBorders>
+            <w:shd w:fill="DBEAFE" w:color="auto" w:val="clear"/>
+            <w:tcMar>
+              <w:top w:type="dxa" w:w="110"/>
+              <w:left w:type="dxa" w:w="160"/>
+              <w:bottom w:type="dxa" w:w="110"/>
+              <w:right w:type="dxa" w:w="160"/>
+            </w:tcMar>
+          </w:tcPr>
+          <w:p>
+            <w:pPr>
+              <w:spacing w:after="20" w:before="0" w:line="276"/>
+            </w:pPr>
+            <w:r>
+              <w:rPr>
+                <w:rFonts w:ascii="Arial" w:cs="Arial" w:eastAsia="Arial" w:hAnsi="Arial"/>
+                <w:b/>
+                <w:bCs/>
+                <w:color w:val="2563EB"/>
+                <w:sz w:val="20"/>
+                <w:szCs w:val="20"/>
+              </w:rPr>
+              <w:t xml:space="preserve">PASO 10 </w:t>
+            </w:r>
+            <w:r>
+              <w:rPr>
+                <w:rFonts w:ascii="Arial" w:cs="Arial" w:eastAsia="Arial" w:hAnsi="Arial"/>
+                <w:b/>
+                <w:bCs/>
+                <w:color w:val="0B2E4F"/>
+                <w:sz w:val="26"/>
+                <w:szCs w:val="26"/>
+              </w:rPr>
+              <w:t xml:space="preserve"> Revisa y publica</w:t>
+            </w:r>
+          </w:p>
+          <w:p>
+            <w:pPr>
+              <w:spacing w:after="0" w:before="0" w:line="276"/>
+            </w:pPr>
+            <w:r>
+              <w:rPr>
+                <w:rFonts w:ascii="Arial" w:cs="Arial" w:eastAsia="Arial" w:hAnsi="Arial"/>
+                <w:color w:val="4B6075"/>
+                <w:sz w:val="18"/>
+                <w:szCs w:val="18"/>
+              </w:rPr>
+              <w:t xml:space="preserve">Marca cada casilla antes de publicar.</w:t>
+            </w:r>
+          </w:p>
+        </w:tc>
+      </w:tr>
+      <w:tr>
+        <w:tc>
+          <w:tcPr>
+            <w:tcW w:type="dxa" w:w="9638"/>
+            <w:tcBorders>
+              <w:top w:val="none" w:color="FFFFFF" w:sz="0"/>
+              <w:left w:val="single" w:color="2563EB" w:sz="10"/>
+              <w:bottom w:val="single" w:color="2563EB" w:sz="10"/>
+              <w:right w:val="single" w:color="2563EB" w:sz="10"/>
+            </w:tcBorders>
+            <w:tcMar>
+              <w:top w:type="dxa" w:w="110"/>
+              <w:left w:type="dxa" w:w="160"/>
+              <w:bottom w:type="dxa" w:w="110"/>
+              <w:right w:type="dxa" w:w="160"/>
+            </w:tcMar>
+          </w:tcPr>
+          <w:p>
+            <w:pPr>
+              <w:spacing w:after="30" w:before="0" w:line="276"/>
+            </w:pPr>
+            <w:r>
+              <w:rPr>
+                <w:rFonts w:ascii="Arial" w:cs="Arial" w:eastAsia="Arial" w:hAnsi="Arial"/>
+                <w:color w:val="1E293B"/>
+                <w:sz w:val="21"/>
+                <w:szCs w:val="21"/>
+              </w:rPr>
+              <w:t xml:space="preserve">☐ Tiene pregunta, hipótesis, variables, materiales, pasos y tabla.</w:t>
+            </w:r>
+          </w:p>
+          <w:p>
+            <w:pPr>
+              <w:spacing w:after="30" w:before="0" w:line="276"/>
+            </w:pPr>
+            <w:r>
+              <w:rPr>
+                <w:rFonts w:ascii="Arial" w:cs="Arial" w:eastAsia="Arial" w:hAnsi="Arial"/>
+                <w:color w:val="1E293B"/>
+                <w:sz w:val="21"/>
+                <w:szCs w:val="21"/>
+              </w:rPr>
+              <w:t xml:space="preserve">☐ Usé mínimo 3 citas con mis palabras.</w:t>
+            </w:r>
+          </w:p>
+          <w:p>
+            <w:pPr>
+              <w:spacing w:after="30" w:before="0" w:line="276"/>
+            </w:pPr>
+            <w:r>
+              <w:rPr>
+                <w:rFonts w:ascii="Arial" w:cs="Arial" w:eastAsia="Arial" w:hAnsi="Arial"/>
+                <w:color w:val="1E293B"/>
+                <w:sz w:val="21"/>
+                <w:szCs w:val="21"/>
+              </w:rPr>
+              <w:t xml:space="preserve">☐ Escribí las fuentes de mis citas.</w:t>
+            </w:r>
+          </w:p>
+          <w:p>
+            <w:pPr>
+              <w:spacing w:after="30" w:before="0" w:line="276"/>
+            </w:pPr>
+            <w:r>
+              <w:rPr>
+                <w:rFonts w:ascii="Arial" w:cs="Arial" w:eastAsia="Arial" w:hAnsi="Arial"/>
+                <w:color w:val="1E293B"/>
+                <w:sz w:val="21"/>
+                <w:szCs w:val="21"/>
+              </w:rPr>
+              <w:t xml:space="preserve">☐ Revisé la ortografía y lo leí en voz alta.</w:t>
+            </w:r>
+          </w:p>
+          <w:p>
+            <w:pPr>
+              <w:spacing w:after="0" w:before="80" w:line="276"/>
+            </w:pPr>
+            <w:r>
+              <w:rPr>
+                <w:rFonts w:ascii="Arial" w:cs="Arial" w:eastAsia="Arial" w:hAnsi="Arial"/>
+                <w:b/>
+                <w:bCs/>
+                <w:color w:val="15803D"/>
+                <w:sz w:val="21"/>
+                <w:szCs w:val="21"/>
+              </w:rPr>
+              <w:t xml:space="preserve">¿Cómo lo publico? </w:t>
+            </w:r>
+            <w:r>
+              <w:rPr>
+                <w:rFonts w:ascii="Arial" w:cs="Arial" w:eastAsia="Arial" w:hAnsi="Arial"/>
+                <w:color w:val="1E293B"/>
+                <w:sz w:val="21"/>
+                <w:szCs w:val="21"/>
+              </w:rPr>
+              <w:t xml:space="preserve">Guarda este Word. En la Revista entra a Publicar propuesta: escribe el título, elige el tipo, pon de 3 a 5 palabras clave, sube esta guía y, si quieres, hasta 3 fotos (irán como Anexos).</w:t>
             </w:r>
           </w:p>
         </w:tc>

</xml_diff>

<commit_message>
Guías: fuentes más fáciles (autor o página, año, tema y link); la página las ordena como «Año: 2025» y el libro muestra los links para abrir
Co-Authored-By: Claude Opus 5.5 <noreply@anthropic.com>
Claude-Session: https://claude.ai/code/session_01GLj1XaXL3zPjkcPgbeyeYx
</commit_message>
<xml_diff>
--- a/docs/guias/dis.docx
+++ b/docs/guias/dis.docx
@@ -2965,7 +2965,7 @@
                 <w:sz w:val="26"/>
                 <w:szCs w:val="26"/>
               </w:rPr>
-              <w:t xml:space="preserve"> Mis fuentes (Referencias APA)</w:t>
+              <w:t xml:space="preserve"> Mis fuentes</w:t>
             </w:r>
           </w:p>
           <w:p>
@@ -2979,7 +2979,7 @@
                 <w:sz w:val="18"/>
                 <w:szCs w:val="18"/>
               </w:rPr>
-              <w:t xml:space="preserve">Escribe de dónde sacaste cada cita.</w:t>
+              <w:t xml:space="preserve">¿De dónde sacaste la información? Completa un recuadro por cada cita.</w:t>
             </w:r>
           </w:p>
         </w:tc>
@@ -3014,23 +3014,7 @@
                 <w:sz w:val="18"/>
                 <w:szCs w:val="18"/>
               </w:rPr>
-              <w:t xml:space="preserve">Orden: Autor o institución. (Año). Título. Página web o libro.</w:t>
-            </w:r>
-          </w:p>
-          <w:p>
-            <w:pPr>
-              <w:spacing w:after="60" w:before="40" w:line="276"/>
-            </w:pPr>
-            <w:r>
-              <w:rPr>
-                <w:rFonts w:ascii="Arial" w:cs="Arial" w:eastAsia="Arial" w:hAnsi="Arial"/>
-                <w:i/>
-                <w:iCs/>
-                <w:color w:val="8A6100"/>
-                <w:sz w:val="18"/>
-                <w:szCs w:val="18"/>
-              </w:rPr>
-              <w:t xml:space="preserve">Ejemplo: Ministerio de Salud. (2025). Dengue: síntomas y prevención. gob.pe</w:t>
+              <w:t xml:space="preserve">Ejemplo: Autor o página: Ministerio de Salud · Año: 2025 · Tema: El dengue · Link: https://www.gob.pe/minsa</w:t>
             </w:r>
           </w:p>
           <w:p>
@@ -3062,29 +3046,268 @@
               </w:tblBorders>
             </w:tblPr>
             <w:tblGrid>
-              <w:gridCol w:w="9318"/>
+              <w:gridCol w:w="2400"/>
+              <w:gridCol w:w="6918"/>
             </w:tblGrid>
             <w:tr>
               <w:tc>
                 <w:tcPr>
-                  <w:tcW w:type="dxa" w:w="9318"/>
-                  <w:tcBorders>
-                    <w:top w:val="single" w:color="93C5FD" w:sz="8"/>
-                    <w:left w:val="single" w:color="93C5FD" w:sz="8"/>
-                    <w:bottom w:val="single" w:color="93C5FD" w:sz="8"/>
-                    <w:right w:val="single" w:color="93C5FD" w:sz="8"/>
+                  <w:tcW w:type="dxa" w:w="2400"/>
+                  <w:tcBorders>
+                    <w:top w:val="single" w:color="93C5FD" w:sz="6"/>
+                    <w:left w:val="single" w:color="93C5FD" w:sz="6"/>
+                    <w:bottom w:val="single" w:color="93C5FD" w:sz="6"/>
+                    <w:right w:val="single" w:color="93C5FD" w:sz="6"/>
+                  </w:tcBorders>
+                  <w:shd w:fill="E7F2FA" w:color="auto" w:val="clear"/>
+                  <w:tcMar>
+                    <w:top w:type="dxa" w:w="110"/>
+                    <w:left w:type="dxa" w:w="160"/>
+                    <w:bottom w:type="dxa" w:w="110"/>
+                    <w:right w:type="dxa" w:w="160"/>
+                  </w:tcMar>
+                </w:tcPr>
+                <w:p>
+                  <w:pPr>
+                    <w:spacing w:after="0" w:before="0" w:line="276"/>
+                  </w:pPr>
+                  <w:r>
+                    <w:rPr>
+                      <w:rFonts w:ascii="Arial" w:cs="Arial" w:eastAsia="Arial" w:hAnsi="Arial"/>
+                      <w:b/>
+                      <w:bCs/>
+                      <w:color w:val="0B2E4F"/>
+                      <w:sz w:val="18"/>
+                      <w:szCs w:val="18"/>
+                    </w:rPr>
+                    <w:t xml:space="preserve">Autor o página</w:t>
+                  </w:r>
+                </w:p>
+              </w:tc>
+              <w:tc>
+                <w:tcPr>
+                  <w:tcW w:type="dxa" w:w="6918"/>
+                  <w:tcBorders>
+                    <w:top w:val="single" w:color="93C5FD" w:sz="6"/>
+                    <w:left w:val="single" w:color="93C5FD" w:sz="6"/>
+                    <w:bottom w:val="single" w:color="93C5FD" w:sz="6"/>
+                    <w:right w:val="single" w:color="93C5FD" w:sz="6"/>
                   </w:tcBorders>
                   <w:shd w:fill="F8FBFF" w:color="auto" w:val="clear"/>
                   <w:tcMar>
-                    <w:top w:type="dxa" w:w="80"/>
-                    <w:left w:type="dxa" w:w="140"/>
-                    <w:bottom w:type="dxa" w:w="80"/>
-                    <w:right w:type="dxa" w:w="140"/>
-                  </w:tcMar>
-                </w:tcPr>
-                <w:p>
-                  <w:pPr>
-                    <w:spacing w:after="0" w:before="0" w:line="420"/>
+                    <w:top w:type="dxa" w:w="110"/>
+                    <w:left w:type="dxa" w:w="160"/>
+                    <w:bottom w:type="dxa" w:w="110"/>
+                    <w:right w:type="dxa" w:w="160"/>
+                  </w:tcMar>
+                </w:tcPr>
+                <w:p>
+                  <w:pPr>
+                    <w:spacing w:after="0" w:before="0" w:line="300"/>
+                  </w:pPr>
+                  <w:r>
+                    <w:rPr>
+                      <w:rFonts w:ascii="Arial" w:cs="Arial" w:eastAsia="Arial" w:hAnsi="Arial"/>
+                      <w:color w:val="1E293B"/>
+                      <w:sz w:val="21"/>
+                      <w:szCs w:val="21"/>
+                    </w:rPr>
+                    <w:t xml:space="preserve"> </w:t>
+                  </w:r>
+                </w:p>
+              </w:tc>
+            </w:tr>
+            <w:tr>
+              <w:tc>
+                <w:tcPr>
+                  <w:tcW w:type="dxa" w:w="2400"/>
+                  <w:tcBorders>
+                    <w:top w:val="single" w:color="93C5FD" w:sz="6"/>
+                    <w:left w:val="single" w:color="93C5FD" w:sz="6"/>
+                    <w:bottom w:val="single" w:color="93C5FD" w:sz="6"/>
+                    <w:right w:val="single" w:color="93C5FD" w:sz="6"/>
+                  </w:tcBorders>
+                  <w:shd w:fill="E7F2FA" w:color="auto" w:val="clear"/>
+                  <w:tcMar>
+                    <w:top w:type="dxa" w:w="110"/>
+                    <w:left w:type="dxa" w:w="160"/>
+                    <w:bottom w:type="dxa" w:w="110"/>
+                    <w:right w:type="dxa" w:w="160"/>
+                  </w:tcMar>
+                </w:tcPr>
+                <w:p>
+                  <w:pPr>
+                    <w:spacing w:after="0" w:before="0" w:line="276"/>
+                  </w:pPr>
+                  <w:r>
+                    <w:rPr>
+                      <w:rFonts w:ascii="Arial" w:cs="Arial" w:eastAsia="Arial" w:hAnsi="Arial"/>
+                      <w:b/>
+                      <w:bCs/>
+                      <w:color w:val="0B2E4F"/>
+                      <w:sz w:val="18"/>
+                      <w:szCs w:val="18"/>
+                    </w:rPr>
+                    <w:t xml:space="preserve">Año</w:t>
+                  </w:r>
+                </w:p>
+              </w:tc>
+              <w:tc>
+                <w:tcPr>
+                  <w:tcW w:type="dxa" w:w="6918"/>
+                  <w:tcBorders>
+                    <w:top w:val="single" w:color="93C5FD" w:sz="6"/>
+                    <w:left w:val="single" w:color="93C5FD" w:sz="6"/>
+                    <w:bottom w:val="single" w:color="93C5FD" w:sz="6"/>
+                    <w:right w:val="single" w:color="93C5FD" w:sz="6"/>
+                  </w:tcBorders>
+                  <w:shd w:fill="F8FBFF" w:color="auto" w:val="clear"/>
+                  <w:tcMar>
+                    <w:top w:type="dxa" w:w="110"/>
+                    <w:left w:type="dxa" w:w="160"/>
+                    <w:bottom w:type="dxa" w:w="110"/>
+                    <w:right w:type="dxa" w:w="160"/>
+                  </w:tcMar>
+                </w:tcPr>
+                <w:p>
+                  <w:pPr>
+                    <w:spacing w:after="0" w:before="0" w:line="300"/>
+                  </w:pPr>
+                  <w:r>
+                    <w:rPr>
+                      <w:rFonts w:ascii="Arial" w:cs="Arial" w:eastAsia="Arial" w:hAnsi="Arial"/>
+                      <w:color w:val="1E293B"/>
+                      <w:sz w:val="21"/>
+                      <w:szCs w:val="21"/>
+                    </w:rPr>
+                    <w:t xml:space="preserve"> </w:t>
+                  </w:r>
+                </w:p>
+              </w:tc>
+            </w:tr>
+            <w:tr>
+              <w:tc>
+                <w:tcPr>
+                  <w:tcW w:type="dxa" w:w="2400"/>
+                  <w:tcBorders>
+                    <w:top w:val="single" w:color="93C5FD" w:sz="6"/>
+                    <w:left w:val="single" w:color="93C5FD" w:sz="6"/>
+                    <w:bottom w:val="single" w:color="93C5FD" w:sz="6"/>
+                    <w:right w:val="single" w:color="93C5FD" w:sz="6"/>
+                  </w:tcBorders>
+                  <w:shd w:fill="E7F2FA" w:color="auto" w:val="clear"/>
+                  <w:tcMar>
+                    <w:top w:type="dxa" w:w="110"/>
+                    <w:left w:type="dxa" w:w="160"/>
+                    <w:bottom w:type="dxa" w:w="110"/>
+                    <w:right w:type="dxa" w:w="160"/>
+                  </w:tcMar>
+                </w:tcPr>
+                <w:p>
+                  <w:pPr>
+                    <w:spacing w:after="0" w:before="0" w:line="276"/>
+                  </w:pPr>
+                  <w:r>
+                    <w:rPr>
+                      <w:rFonts w:ascii="Arial" w:cs="Arial" w:eastAsia="Arial" w:hAnsi="Arial"/>
+                      <w:b/>
+                      <w:bCs/>
+                      <w:color w:val="0B2E4F"/>
+                      <w:sz w:val="18"/>
+                      <w:szCs w:val="18"/>
+                    </w:rPr>
+                    <w:t xml:space="preserve">Tema</w:t>
+                  </w:r>
+                </w:p>
+              </w:tc>
+              <w:tc>
+                <w:tcPr>
+                  <w:tcW w:type="dxa" w:w="6918"/>
+                  <w:tcBorders>
+                    <w:top w:val="single" w:color="93C5FD" w:sz="6"/>
+                    <w:left w:val="single" w:color="93C5FD" w:sz="6"/>
+                    <w:bottom w:val="single" w:color="93C5FD" w:sz="6"/>
+                    <w:right w:val="single" w:color="93C5FD" w:sz="6"/>
+                  </w:tcBorders>
+                  <w:shd w:fill="F8FBFF" w:color="auto" w:val="clear"/>
+                  <w:tcMar>
+                    <w:top w:type="dxa" w:w="110"/>
+                    <w:left w:type="dxa" w:w="160"/>
+                    <w:bottom w:type="dxa" w:w="110"/>
+                    <w:right w:type="dxa" w:w="160"/>
+                  </w:tcMar>
+                </w:tcPr>
+                <w:p>
+                  <w:pPr>
+                    <w:spacing w:after="0" w:before="0" w:line="300"/>
+                  </w:pPr>
+                  <w:r>
+                    <w:rPr>
+                      <w:rFonts w:ascii="Arial" w:cs="Arial" w:eastAsia="Arial" w:hAnsi="Arial"/>
+                      <w:color w:val="1E293B"/>
+                      <w:sz w:val="21"/>
+                      <w:szCs w:val="21"/>
+                    </w:rPr>
+                    <w:t xml:space="preserve"> </w:t>
+                  </w:r>
+                </w:p>
+              </w:tc>
+            </w:tr>
+            <w:tr>
+              <w:tc>
+                <w:tcPr>
+                  <w:tcW w:type="dxa" w:w="2400"/>
+                  <w:tcBorders>
+                    <w:top w:val="single" w:color="93C5FD" w:sz="6"/>
+                    <w:left w:val="single" w:color="93C5FD" w:sz="6"/>
+                    <w:bottom w:val="single" w:color="93C5FD" w:sz="6"/>
+                    <w:right w:val="single" w:color="93C5FD" w:sz="6"/>
+                  </w:tcBorders>
+                  <w:shd w:fill="E7F2FA" w:color="auto" w:val="clear"/>
+                  <w:tcMar>
+                    <w:top w:type="dxa" w:w="110"/>
+                    <w:left w:type="dxa" w:w="160"/>
+                    <w:bottom w:type="dxa" w:w="110"/>
+                    <w:right w:type="dxa" w:w="160"/>
+                  </w:tcMar>
+                </w:tcPr>
+                <w:p>
+                  <w:pPr>
+                    <w:spacing w:after="0" w:before="0" w:line="276"/>
+                  </w:pPr>
+                  <w:r>
+                    <w:rPr>
+                      <w:rFonts w:ascii="Arial" w:cs="Arial" w:eastAsia="Arial" w:hAnsi="Arial"/>
+                      <w:b/>
+                      <w:bCs/>
+                      <w:color w:val="0B2E4F"/>
+                      <w:sz w:val="18"/>
+                      <w:szCs w:val="18"/>
+                    </w:rPr>
+                    <w:t xml:space="preserve">Link</w:t>
+                  </w:r>
+                </w:p>
+              </w:tc>
+              <w:tc>
+                <w:tcPr>
+                  <w:tcW w:type="dxa" w:w="6918"/>
+                  <w:tcBorders>
+                    <w:top w:val="single" w:color="93C5FD" w:sz="6"/>
+                    <w:left w:val="single" w:color="93C5FD" w:sz="6"/>
+                    <w:bottom w:val="single" w:color="93C5FD" w:sz="6"/>
+                    <w:right w:val="single" w:color="93C5FD" w:sz="6"/>
+                  </w:tcBorders>
+                  <w:shd w:fill="F8FBFF" w:color="auto" w:val="clear"/>
+                  <w:tcMar>
+                    <w:top w:type="dxa" w:w="110"/>
+                    <w:left w:type="dxa" w:w="160"/>
+                    <w:bottom w:type="dxa" w:w="110"/>
+                    <w:right w:type="dxa" w:w="160"/>
+                  </w:tcMar>
+                </w:tcPr>
+                <w:p>
+                  <w:pPr>
+                    <w:spacing w:after="0" w:before="0" w:line="300"/>
                   </w:pPr>
                   <w:r>
                     <w:rPr>
@@ -3101,7 +3324,7 @@
           </w:tbl>
           <w:p>
             <w:pPr>
-              <w:spacing w:after="60" w:before="0" w:line="276"/>
+              <w:spacing w:after="80" w:before="0" w:line="276"/>
             </w:pPr>
             <w:r>
               <w:rPr>
@@ -3142,29 +3365,268 @@
               </w:tblBorders>
             </w:tblPr>
             <w:tblGrid>
-              <w:gridCol w:w="9318"/>
+              <w:gridCol w:w="2400"/>
+              <w:gridCol w:w="6918"/>
             </w:tblGrid>
             <w:tr>
               <w:tc>
                 <w:tcPr>
-                  <w:tcW w:type="dxa" w:w="9318"/>
-                  <w:tcBorders>
-                    <w:top w:val="single" w:color="93C5FD" w:sz="8"/>
-                    <w:left w:val="single" w:color="93C5FD" w:sz="8"/>
-                    <w:bottom w:val="single" w:color="93C5FD" w:sz="8"/>
-                    <w:right w:val="single" w:color="93C5FD" w:sz="8"/>
+                  <w:tcW w:type="dxa" w:w="2400"/>
+                  <w:tcBorders>
+                    <w:top w:val="single" w:color="93C5FD" w:sz="6"/>
+                    <w:left w:val="single" w:color="93C5FD" w:sz="6"/>
+                    <w:bottom w:val="single" w:color="93C5FD" w:sz="6"/>
+                    <w:right w:val="single" w:color="93C5FD" w:sz="6"/>
+                  </w:tcBorders>
+                  <w:shd w:fill="E7F2FA" w:color="auto" w:val="clear"/>
+                  <w:tcMar>
+                    <w:top w:type="dxa" w:w="110"/>
+                    <w:left w:type="dxa" w:w="160"/>
+                    <w:bottom w:type="dxa" w:w="110"/>
+                    <w:right w:type="dxa" w:w="160"/>
+                  </w:tcMar>
+                </w:tcPr>
+                <w:p>
+                  <w:pPr>
+                    <w:spacing w:after="0" w:before="0" w:line="276"/>
+                  </w:pPr>
+                  <w:r>
+                    <w:rPr>
+                      <w:rFonts w:ascii="Arial" w:cs="Arial" w:eastAsia="Arial" w:hAnsi="Arial"/>
+                      <w:b/>
+                      <w:bCs/>
+                      <w:color w:val="0B2E4F"/>
+                      <w:sz w:val="18"/>
+                      <w:szCs w:val="18"/>
+                    </w:rPr>
+                    <w:t xml:space="preserve">Autor o página</w:t>
+                  </w:r>
+                </w:p>
+              </w:tc>
+              <w:tc>
+                <w:tcPr>
+                  <w:tcW w:type="dxa" w:w="6918"/>
+                  <w:tcBorders>
+                    <w:top w:val="single" w:color="93C5FD" w:sz="6"/>
+                    <w:left w:val="single" w:color="93C5FD" w:sz="6"/>
+                    <w:bottom w:val="single" w:color="93C5FD" w:sz="6"/>
+                    <w:right w:val="single" w:color="93C5FD" w:sz="6"/>
                   </w:tcBorders>
                   <w:shd w:fill="F8FBFF" w:color="auto" w:val="clear"/>
                   <w:tcMar>
-                    <w:top w:type="dxa" w:w="80"/>
-                    <w:left w:type="dxa" w:w="140"/>
-                    <w:bottom w:type="dxa" w:w="80"/>
-                    <w:right w:type="dxa" w:w="140"/>
-                  </w:tcMar>
-                </w:tcPr>
-                <w:p>
-                  <w:pPr>
-                    <w:spacing w:after="0" w:before="0" w:line="420"/>
+                    <w:top w:type="dxa" w:w="110"/>
+                    <w:left w:type="dxa" w:w="160"/>
+                    <w:bottom w:type="dxa" w:w="110"/>
+                    <w:right w:type="dxa" w:w="160"/>
+                  </w:tcMar>
+                </w:tcPr>
+                <w:p>
+                  <w:pPr>
+                    <w:spacing w:after="0" w:before="0" w:line="300"/>
+                  </w:pPr>
+                  <w:r>
+                    <w:rPr>
+                      <w:rFonts w:ascii="Arial" w:cs="Arial" w:eastAsia="Arial" w:hAnsi="Arial"/>
+                      <w:color w:val="1E293B"/>
+                      <w:sz w:val="21"/>
+                      <w:szCs w:val="21"/>
+                    </w:rPr>
+                    <w:t xml:space="preserve"> </w:t>
+                  </w:r>
+                </w:p>
+              </w:tc>
+            </w:tr>
+            <w:tr>
+              <w:tc>
+                <w:tcPr>
+                  <w:tcW w:type="dxa" w:w="2400"/>
+                  <w:tcBorders>
+                    <w:top w:val="single" w:color="93C5FD" w:sz="6"/>
+                    <w:left w:val="single" w:color="93C5FD" w:sz="6"/>
+                    <w:bottom w:val="single" w:color="93C5FD" w:sz="6"/>
+                    <w:right w:val="single" w:color="93C5FD" w:sz="6"/>
+                  </w:tcBorders>
+                  <w:shd w:fill="E7F2FA" w:color="auto" w:val="clear"/>
+                  <w:tcMar>
+                    <w:top w:type="dxa" w:w="110"/>
+                    <w:left w:type="dxa" w:w="160"/>
+                    <w:bottom w:type="dxa" w:w="110"/>
+                    <w:right w:type="dxa" w:w="160"/>
+                  </w:tcMar>
+                </w:tcPr>
+                <w:p>
+                  <w:pPr>
+                    <w:spacing w:after="0" w:before="0" w:line="276"/>
+                  </w:pPr>
+                  <w:r>
+                    <w:rPr>
+                      <w:rFonts w:ascii="Arial" w:cs="Arial" w:eastAsia="Arial" w:hAnsi="Arial"/>
+                      <w:b/>
+                      <w:bCs/>
+                      <w:color w:val="0B2E4F"/>
+                      <w:sz w:val="18"/>
+                      <w:szCs w:val="18"/>
+                    </w:rPr>
+                    <w:t xml:space="preserve">Año</w:t>
+                  </w:r>
+                </w:p>
+              </w:tc>
+              <w:tc>
+                <w:tcPr>
+                  <w:tcW w:type="dxa" w:w="6918"/>
+                  <w:tcBorders>
+                    <w:top w:val="single" w:color="93C5FD" w:sz="6"/>
+                    <w:left w:val="single" w:color="93C5FD" w:sz="6"/>
+                    <w:bottom w:val="single" w:color="93C5FD" w:sz="6"/>
+                    <w:right w:val="single" w:color="93C5FD" w:sz="6"/>
+                  </w:tcBorders>
+                  <w:shd w:fill="F8FBFF" w:color="auto" w:val="clear"/>
+                  <w:tcMar>
+                    <w:top w:type="dxa" w:w="110"/>
+                    <w:left w:type="dxa" w:w="160"/>
+                    <w:bottom w:type="dxa" w:w="110"/>
+                    <w:right w:type="dxa" w:w="160"/>
+                  </w:tcMar>
+                </w:tcPr>
+                <w:p>
+                  <w:pPr>
+                    <w:spacing w:after="0" w:before="0" w:line="300"/>
+                  </w:pPr>
+                  <w:r>
+                    <w:rPr>
+                      <w:rFonts w:ascii="Arial" w:cs="Arial" w:eastAsia="Arial" w:hAnsi="Arial"/>
+                      <w:color w:val="1E293B"/>
+                      <w:sz w:val="21"/>
+                      <w:szCs w:val="21"/>
+                    </w:rPr>
+                    <w:t xml:space="preserve"> </w:t>
+                  </w:r>
+                </w:p>
+              </w:tc>
+            </w:tr>
+            <w:tr>
+              <w:tc>
+                <w:tcPr>
+                  <w:tcW w:type="dxa" w:w="2400"/>
+                  <w:tcBorders>
+                    <w:top w:val="single" w:color="93C5FD" w:sz="6"/>
+                    <w:left w:val="single" w:color="93C5FD" w:sz="6"/>
+                    <w:bottom w:val="single" w:color="93C5FD" w:sz="6"/>
+                    <w:right w:val="single" w:color="93C5FD" w:sz="6"/>
+                  </w:tcBorders>
+                  <w:shd w:fill="E7F2FA" w:color="auto" w:val="clear"/>
+                  <w:tcMar>
+                    <w:top w:type="dxa" w:w="110"/>
+                    <w:left w:type="dxa" w:w="160"/>
+                    <w:bottom w:type="dxa" w:w="110"/>
+                    <w:right w:type="dxa" w:w="160"/>
+                  </w:tcMar>
+                </w:tcPr>
+                <w:p>
+                  <w:pPr>
+                    <w:spacing w:after="0" w:before="0" w:line="276"/>
+                  </w:pPr>
+                  <w:r>
+                    <w:rPr>
+                      <w:rFonts w:ascii="Arial" w:cs="Arial" w:eastAsia="Arial" w:hAnsi="Arial"/>
+                      <w:b/>
+                      <w:bCs/>
+                      <w:color w:val="0B2E4F"/>
+                      <w:sz w:val="18"/>
+                      <w:szCs w:val="18"/>
+                    </w:rPr>
+                    <w:t xml:space="preserve">Tema</w:t>
+                  </w:r>
+                </w:p>
+              </w:tc>
+              <w:tc>
+                <w:tcPr>
+                  <w:tcW w:type="dxa" w:w="6918"/>
+                  <w:tcBorders>
+                    <w:top w:val="single" w:color="93C5FD" w:sz="6"/>
+                    <w:left w:val="single" w:color="93C5FD" w:sz="6"/>
+                    <w:bottom w:val="single" w:color="93C5FD" w:sz="6"/>
+                    <w:right w:val="single" w:color="93C5FD" w:sz="6"/>
+                  </w:tcBorders>
+                  <w:shd w:fill="F8FBFF" w:color="auto" w:val="clear"/>
+                  <w:tcMar>
+                    <w:top w:type="dxa" w:w="110"/>
+                    <w:left w:type="dxa" w:w="160"/>
+                    <w:bottom w:type="dxa" w:w="110"/>
+                    <w:right w:type="dxa" w:w="160"/>
+                  </w:tcMar>
+                </w:tcPr>
+                <w:p>
+                  <w:pPr>
+                    <w:spacing w:after="0" w:before="0" w:line="300"/>
+                  </w:pPr>
+                  <w:r>
+                    <w:rPr>
+                      <w:rFonts w:ascii="Arial" w:cs="Arial" w:eastAsia="Arial" w:hAnsi="Arial"/>
+                      <w:color w:val="1E293B"/>
+                      <w:sz w:val="21"/>
+                      <w:szCs w:val="21"/>
+                    </w:rPr>
+                    <w:t xml:space="preserve"> </w:t>
+                  </w:r>
+                </w:p>
+              </w:tc>
+            </w:tr>
+            <w:tr>
+              <w:tc>
+                <w:tcPr>
+                  <w:tcW w:type="dxa" w:w="2400"/>
+                  <w:tcBorders>
+                    <w:top w:val="single" w:color="93C5FD" w:sz="6"/>
+                    <w:left w:val="single" w:color="93C5FD" w:sz="6"/>
+                    <w:bottom w:val="single" w:color="93C5FD" w:sz="6"/>
+                    <w:right w:val="single" w:color="93C5FD" w:sz="6"/>
+                  </w:tcBorders>
+                  <w:shd w:fill="E7F2FA" w:color="auto" w:val="clear"/>
+                  <w:tcMar>
+                    <w:top w:type="dxa" w:w="110"/>
+                    <w:left w:type="dxa" w:w="160"/>
+                    <w:bottom w:type="dxa" w:w="110"/>
+                    <w:right w:type="dxa" w:w="160"/>
+                  </w:tcMar>
+                </w:tcPr>
+                <w:p>
+                  <w:pPr>
+                    <w:spacing w:after="0" w:before="0" w:line="276"/>
+                  </w:pPr>
+                  <w:r>
+                    <w:rPr>
+                      <w:rFonts w:ascii="Arial" w:cs="Arial" w:eastAsia="Arial" w:hAnsi="Arial"/>
+                      <w:b/>
+                      <w:bCs/>
+                      <w:color w:val="0B2E4F"/>
+                      <w:sz w:val="18"/>
+                      <w:szCs w:val="18"/>
+                    </w:rPr>
+                    <w:t xml:space="preserve">Link</w:t>
+                  </w:r>
+                </w:p>
+              </w:tc>
+              <w:tc>
+                <w:tcPr>
+                  <w:tcW w:type="dxa" w:w="6918"/>
+                  <w:tcBorders>
+                    <w:top w:val="single" w:color="93C5FD" w:sz="6"/>
+                    <w:left w:val="single" w:color="93C5FD" w:sz="6"/>
+                    <w:bottom w:val="single" w:color="93C5FD" w:sz="6"/>
+                    <w:right w:val="single" w:color="93C5FD" w:sz="6"/>
+                  </w:tcBorders>
+                  <w:shd w:fill="F8FBFF" w:color="auto" w:val="clear"/>
+                  <w:tcMar>
+                    <w:top w:type="dxa" w:w="110"/>
+                    <w:left w:type="dxa" w:w="160"/>
+                    <w:bottom w:type="dxa" w:w="110"/>
+                    <w:right w:type="dxa" w:w="160"/>
+                  </w:tcMar>
+                </w:tcPr>
+                <w:p>
+                  <w:pPr>
+                    <w:spacing w:after="0" w:before="0" w:line="300"/>
                   </w:pPr>
                   <w:r>
                     <w:rPr>
@@ -3181,7 +3643,7 @@
           </w:tbl>
           <w:p>
             <w:pPr>
-              <w:spacing w:after="60" w:before="0" w:line="276"/>
+              <w:spacing w:after="80" w:before="0" w:line="276"/>
             </w:pPr>
             <w:r>
               <w:rPr>
@@ -3222,29 +3684,268 @@
               </w:tblBorders>
             </w:tblPr>
             <w:tblGrid>
-              <w:gridCol w:w="9318"/>
+              <w:gridCol w:w="2400"/>
+              <w:gridCol w:w="6918"/>
             </w:tblGrid>
             <w:tr>
               <w:tc>
                 <w:tcPr>
-                  <w:tcW w:type="dxa" w:w="9318"/>
-                  <w:tcBorders>
-                    <w:top w:val="single" w:color="93C5FD" w:sz="8"/>
-                    <w:left w:val="single" w:color="93C5FD" w:sz="8"/>
-                    <w:bottom w:val="single" w:color="93C5FD" w:sz="8"/>
-                    <w:right w:val="single" w:color="93C5FD" w:sz="8"/>
+                  <w:tcW w:type="dxa" w:w="2400"/>
+                  <w:tcBorders>
+                    <w:top w:val="single" w:color="93C5FD" w:sz="6"/>
+                    <w:left w:val="single" w:color="93C5FD" w:sz="6"/>
+                    <w:bottom w:val="single" w:color="93C5FD" w:sz="6"/>
+                    <w:right w:val="single" w:color="93C5FD" w:sz="6"/>
+                  </w:tcBorders>
+                  <w:shd w:fill="E7F2FA" w:color="auto" w:val="clear"/>
+                  <w:tcMar>
+                    <w:top w:type="dxa" w:w="110"/>
+                    <w:left w:type="dxa" w:w="160"/>
+                    <w:bottom w:type="dxa" w:w="110"/>
+                    <w:right w:type="dxa" w:w="160"/>
+                  </w:tcMar>
+                </w:tcPr>
+                <w:p>
+                  <w:pPr>
+                    <w:spacing w:after="0" w:before="0" w:line="276"/>
+                  </w:pPr>
+                  <w:r>
+                    <w:rPr>
+                      <w:rFonts w:ascii="Arial" w:cs="Arial" w:eastAsia="Arial" w:hAnsi="Arial"/>
+                      <w:b/>
+                      <w:bCs/>
+                      <w:color w:val="0B2E4F"/>
+                      <w:sz w:val="18"/>
+                      <w:szCs w:val="18"/>
+                    </w:rPr>
+                    <w:t xml:space="preserve">Autor o página</w:t>
+                  </w:r>
+                </w:p>
+              </w:tc>
+              <w:tc>
+                <w:tcPr>
+                  <w:tcW w:type="dxa" w:w="6918"/>
+                  <w:tcBorders>
+                    <w:top w:val="single" w:color="93C5FD" w:sz="6"/>
+                    <w:left w:val="single" w:color="93C5FD" w:sz="6"/>
+                    <w:bottom w:val="single" w:color="93C5FD" w:sz="6"/>
+                    <w:right w:val="single" w:color="93C5FD" w:sz="6"/>
                   </w:tcBorders>
                   <w:shd w:fill="F8FBFF" w:color="auto" w:val="clear"/>
                   <w:tcMar>
-                    <w:top w:type="dxa" w:w="80"/>
-                    <w:left w:type="dxa" w:w="140"/>
-                    <w:bottom w:type="dxa" w:w="80"/>
-                    <w:right w:type="dxa" w:w="140"/>
-                  </w:tcMar>
-                </w:tcPr>
-                <w:p>
-                  <w:pPr>
-                    <w:spacing w:after="0" w:before="0" w:line="420"/>
+                    <w:top w:type="dxa" w:w="110"/>
+                    <w:left w:type="dxa" w:w="160"/>
+                    <w:bottom w:type="dxa" w:w="110"/>
+                    <w:right w:type="dxa" w:w="160"/>
+                  </w:tcMar>
+                </w:tcPr>
+                <w:p>
+                  <w:pPr>
+                    <w:spacing w:after="0" w:before="0" w:line="300"/>
+                  </w:pPr>
+                  <w:r>
+                    <w:rPr>
+                      <w:rFonts w:ascii="Arial" w:cs="Arial" w:eastAsia="Arial" w:hAnsi="Arial"/>
+                      <w:color w:val="1E293B"/>
+                      <w:sz w:val="21"/>
+                      <w:szCs w:val="21"/>
+                    </w:rPr>
+                    <w:t xml:space="preserve"> </w:t>
+                  </w:r>
+                </w:p>
+              </w:tc>
+            </w:tr>
+            <w:tr>
+              <w:tc>
+                <w:tcPr>
+                  <w:tcW w:type="dxa" w:w="2400"/>
+                  <w:tcBorders>
+                    <w:top w:val="single" w:color="93C5FD" w:sz="6"/>
+                    <w:left w:val="single" w:color="93C5FD" w:sz="6"/>
+                    <w:bottom w:val="single" w:color="93C5FD" w:sz="6"/>
+                    <w:right w:val="single" w:color="93C5FD" w:sz="6"/>
+                  </w:tcBorders>
+                  <w:shd w:fill="E7F2FA" w:color="auto" w:val="clear"/>
+                  <w:tcMar>
+                    <w:top w:type="dxa" w:w="110"/>
+                    <w:left w:type="dxa" w:w="160"/>
+                    <w:bottom w:type="dxa" w:w="110"/>
+                    <w:right w:type="dxa" w:w="160"/>
+                  </w:tcMar>
+                </w:tcPr>
+                <w:p>
+                  <w:pPr>
+                    <w:spacing w:after="0" w:before="0" w:line="276"/>
+                  </w:pPr>
+                  <w:r>
+                    <w:rPr>
+                      <w:rFonts w:ascii="Arial" w:cs="Arial" w:eastAsia="Arial" w:hAnsi="Arial"/>
+                      <w:b/>
+                      <w:bCs/>
+                      <w:color w:val="0B2E4F"/>
+                      <w:sz w:val="18"/>
+                      <w:szCs w:val="18"/>
+                    </w:rPr>
+                    <w:t xml:space="preserve">Año</w:t>
+                  </w:r>
+                </w:p>
+              </w:tc>
+              <w:tc>
+                <w:tcPr>
+                  <w:tcW w:type="dxa" w:w="6918"/>
+                  <w:tcBorders>
+                    <w:top w:val="single" w:color="93C5FD" w:sz="6"/>
+                    <w:left w:val="single" w:color="93C5FD" w:sz="6"/>
+                    <w:bottom w:val="single" w:color="93C5FD" w:sz="6"/>
+                    <w:right w:val="single" w:color="93C5FD" w:sz="6"/>
+                  </w:tcBorders>
+                  <w:shd w:fill="F8FBFF" w:color="auto" w:val="clear"/>
+                  <w:tcMar>
+                    <w:top w:type="dxa" w:w="110"/>
+                    <w:left w:type="dxa" w:w="160"/>
+                    <w:bottom w:type="dxa" w:w="110"/>
+                    <w:right w:type="dxa" w:w="160"/>
+                  </w:tcMar>
+                </w:tcPr>
+                <w:p>
+                  <w:pPr>
+                    <w:spacing w:after="0" w:before="0" w:line="300"/>
+                  </w:pPr>
+                  <w:r>
+                    <w:rPr>
+                      <w:rFonts w:ascii="Arial" w:cs="Arial" w:eastAsia="Arial" w:hAnsi="Arial"/>
+                      <w:color w:val="1E293B"/>
+                      <w:sz w:val="21"/>
+                      <w:szCs w:val="21"/>
+                    </w:rPr>
+                    <w:t xml:space="preserve"> </w:t>
+                  </w:r>
+                </w:p>
+              </w:tc>
+            </w:tr>
+            <w:tr>
+              <w:tc>
+                <w:tcPr>
+                  <w:tcW w:type="dxa" w:w="2400"/>
+                  <w:tcBorders>
+                    <w:top w:val="single" w:color="93C5FD" w:sz="6"/>
+                    <w:left w:val="single" w:color="93C5FD" w:sz="6"/>
+                    <w:bottom w:val="single" w:color="93C5FD" w:sz="6"/>
+                    <w:right w:val="single" w:color="93C5FD" w:sz="6"/>
+                  </w:tcBorders>
+                  <w:shd w:fill="E7F2FA" w:color="auto" w:val="clear"/>
+                  <w:tcMar>
+                    <w:top w:type="dxa" w:w="110"/>
+                    <w:left w:type="dxa" w:w="160"/>
+                    <w:bottom w:type="dxa" w:w="110"/>
+                    <w:right w:type="dxa" w:w="160"/>
+                  </w:tcMar>
+                </w:tcPr>
+                <w:p>
+                  <w:pPr>
+                    <w:spacing w:after="0" w:before="0" w:line="276"/>
+                  </w:pPr>
+                  <w:r>
+                    <w:rPr>
+                      <w:rFonts w:ascii="Arial" w:cs="Arial" w:eastAsia="Arial" w:hAnsi="Arial"/>
+                      <w:b/>
+                      <w:bCs/>
+                      <w:color w:val="0B2E4F"/>
+                      <w:sz w:val="18"/>
+                      <w:szCs w:val="18"/>
+                    </w:rPr>
+                    <w:t xml:space="preserve">Tema</w:t>
+                  </w:r>
+                </w:p>
+              </w:tc>
+              <w:tc>
+                <w:tcPr>
+                  <w:tcW w:type="dxa" w:w="6918"/>
+                  <w:tcBorders>
+                    <w:top w:val="single" w:color="93C5FD" w:sz="6"/>
+                    <w:left w:val="single" w:color="93C5FD" w:sz="6"/>
+                    <w:bottom w:val="single" w:color="93C5FD" w:sz="6"/>
+                    <w:right w:val="single" w:color="93C5FD" w:sz="6"/>
+                  </w:tcBorders>
+                  <w:shd w:fill="F8FBFF" w:color="auto" w:val="clear"/>
+                  <w:tcMar>
+                    <w:top w:type="dxa" w:w="110"/>
+                    <w:left w:type="dxa" w:w="160"/>
+                    <w:bottom w:type="dxa" w:w="110"/>
+                    <w:right w:type="dxa" w:w="160"/>
+                  </w:tcMar>
+                </w:tcPr>
+                <w:p>
+                  <w:pPr>
+                    <w:spacing w:after="0" w:before="0" w:line="300"/>
+                  </w:pPr>
+                  <w:r>
+                    <w:rPr>
+                      <w:rFonts w:ascii="Arial" w:cs="Arial" w:eastAsia="Arial" w:hAnsi="Arial"/>
+                      <w:color w:val="1E293B"/>
+                      <w:sz w:val="21"/>
+                      <w:szCs w:val="21"/>
+                    </w:rPr>
+                    <w:t xml:space="preserve"> </w:t>
+                  </w:r>
+                </w:p>
+              </w:tc>
+            </w:tr>
+            <w:tr>
+              <w:tc>
+                <w:tcPr>
+                  <w:tcW w:type="dxa" w:w="2400"/>
+                  <w:tcBorders>
+                    <w:top w:val="single" w:color="93C5FD" w:sz="6"/>
+                    <w:left w:val="single" w:color="93C5FD" w:sz="6"/>
+                    <w:bottom w:val="single" w:color="93C5FD" w:sz="6"/>
+                    <w:right w:val="single" w:color="93C5FD" w:sz="6"/>
+                  </w:tcBorders>
+                  <w:shd w:fill="E7F2FA" w:color="auto" w:val="clear"/>
+                  <w:tcMar>
+                    <w:top w:type="dxa" w:w="110"/>
+                    <w:left w:type="dxa" w:w="160"/>
+                    <w:bottom w:type="dxa" w:w="110"/>
+                    <w:right w:type="dxa" w:w="160"/>
+                  </w:tcMar>
+                </w:tcPr>
+                <w:p>
+                  <w:pPr>
+                    <w:spacing w:after="0" w:before="0" w:line="276"/>
+                  </w:pPr>
+                  <w:r>
+                    <w:rPr>
+                      <w:rFonts w:ascii="Arial" w:cs="Arial" w:eastAsia="Arial" w:hAnsi="Arial"/>
+                      <w:b/>
+                      <w:bCs/>
+                      <w:color w:val="0B2E4F"/>
+                      <w:sz w:val="18"/>
+                      <w:szCs w:val="18"/>
+                    </w:rPr>
+                    <w:t xml:space="preserve">Link</w:t>
+                  </w:r>
+                </w:p>
+              </w:tc>
+              <w:tc>
+                <w:tcPr>
+                  <w:tcW w:type="dxa" w:w="6918"/>
+                  <w:tcBorders>
+                    <w:top w:val="single" w:color="93C5FD" w:sz="6"/>
+                    <w:left w:val="single" w:color="93C5FD" w:sz="6"/>
+                    <w:bottom w:val="single" w:color="93C5FD" w:sz="6"/>
+                    <w:right w:val="single" w:color="93C5FD" w:sz="6"/>
+                  </w:tcBorders>
+                  <w:shd w:fill="F8FBFF" w:color="auto" w:val="clear"/>
+                  <w:tcMar>
+                    <w:top w:type="dxa" w:w="110"/>
+                    <w:left w:type="dxa" w:w="160"/>
+                    <w:bottom w:type="dxa" w:w="110"/>
+                    <w:right w:type="dxa" w:w="160"/>
+                  </w:tcMar>
+                </w:tcPr>
+                <w:p>
+                  <w:pPr>
+                    <w:spacing w:after="0" w:before="0" w:line="300"/>
                   </w:pPr>
                   <w:r>
                     <w:rPr>
@@ -3261,7 +3962,7 @@
           </w:tbl>
           <w:p>
             <w:pPr>
-              <w:spacing w:after="60" w:before="0" w:line="276"/>
+              <w:spacing w:after="80" w:before="0" w:line="276"/>
             </w:pPr>
             <w:r>
               <w:rPr>

</xml_diff>